<commit_message>
Ana mimari raporu güncellendi: VPS demo ve hibrit satış stratejisi eklendi
</commit_message>
<xml_diff>
--- a/Dosyalar/Ana-Mimari.docx
+++ b/Dosyalar/Ana-Mimari.docx
@@ -29,7 +29,7 @@
           <w:color w:val="3182CE"/>
           <w:sz w:val="28"/>
         </w:rPr>
-        <w:t>SİSTEM MİMARİSİ VE KATMANLAR RAPORU</w:t>
+        <w:t>SİSTEM MİMARİSİ VE DAĞITIM STRATEJİSİ RAPORU</w:t>
       </w:r>
     </w:p>
     <w:p>
@@ -44,7 +44,7 @@
           <w:color w:val="718096"/>
           <w:sz w:val="19"/>
         </w:rPr>
-        <w:t>Doküman Türü: Mimari Tasarım &amp; Katman Analizi  |  Hedef: Sıfır Maliyetli PoC → Azure Enterprise Geçişi</w:t>
+        <w:t>Doküman Türü: Mimari Tasarım &amp; Dağıtım Planı  |  Hedef: $0 PoC → VPS Demo → Hibrit Satış (VPS / Azure)</w:t>
       </w:r>
     </w:p>
     <w:p>
@@ -57,7 +57,7 @@
           <w:color w:val="2D3748"/>
           <w:sz w:val="21"/>
         </w:rPr>
-        <w:t>Bu rapor, gıda distribütörlüğü saha operasyonlarındaki 17 kolonluk Excel karmaşasını bitirmek, sahadaki satış temsilcisinin 30 saniyede zahmetsizce veri girmesini sağlamak ve 0 TL PoC aşamasından Azure Kurumsal (Enterprise) ortamına tek bir satır iş mantığı kodu değiştirmeden geçmek üzere tasarlanan sistem katmanlarını, sorumluluklarını ve resmi teknoloji yığınını tanımlar.</w:t>
+        <w:t>Bu rapor, gıda distribütörlüğü saha operasyonlarındaki 17 kolonluk Excel karmaşasını bitirmek, sahadaki satış temsilcisinin 30 saniyede zahmetsizce veri girmesini sağlamak ve 0 TL PoC aşamasından başlayarak, yüksek performanslı VPS demo ortamına ve ardından müşterinin tercihine göre Ekonomik VPS ya da Azure Kurumsal (Enterprise) altyapısına sıfır kod değişikliğiyle geçiş yapabilen esnek mimariyi belgeler.</w:t>
       </w:r>
     </w:p>
     <w:p>
@@ -95,10 +95,10 @@
           <w:tcPr>
             <w:tcW w:type="dxa" w:w="1728"/>
             <w:tcMar>
-              <w:top w:w="100" w:type="dxa"/>
-              <w:bottom w:w="100" w:type="dxa"/>
-              <w:left w:w="120" w:type="dxa"/>
-              <w:right w:w="120" w:type="dxa"/>
+              <w:top w:w="90" w:type="dxa"/>
+              <w:bottom w:w="90" w:type="dxa"/>
+              <w:left w:w="100" w:type="dxa"/>
+              <w:right w:w="100" w:type="dxa"/>
             </w:tcMar>
             <w:shd w:fill="1A365D"/>
           </w:tcPr>
@@ -111,7 +111,7 @@
                 <w:rFonts w:ascii="Calibri" w:hAnsi="Calibri"/>
                 <w:b/>
                 <w:color w:val="FFFFFF"/>
-                <w:sz w:val="19"/>
+                <w:sz w:val="18"/>
               </w:rPr>
               <w:t>Katman</w:t>
             </w:r>
@@ -119,12 +119,12 @@
         </w:tc>
         <w:tc>
           <w:tcPr>
-            <w:tcW w:type="dxa" w:w="2160"/>
+            <w:tcW w:type="dxa" w:w="2016"/>
             <w:tcMar>
-              <w:top w:w="100" w:type="dxa"/>
-              <w:bottom w:w="100" w:type="dxa"/>
-              <w:left w:w="120" w:type="dxa"/>
-              <w:right w:w="120" w:type="dxa"/>
+              <w:top w:w="90" w:type="dxa"/>
+              <w:bottom w:w="90" w:type="dxa"/>
+              <w:left w:w="100" w:type="dxa"/>
+              <w:right w:w="100" w:type="dxa"/>
             </w:tcMar>
             <w:shd w:fill="1A365D"/>
           </w:tcPr>
@@ -137,7 +137,7 @@
                 <w:rFonts w:ascii="Calibri" w:hAnsi="Calibri"/>
                 <w:b/>
                 <w:color w:val="FFFFFF"/>
-                <w:sz w:val="19"/>
+                <w:sz w:val="18"/>
               </w:rPr>
               <w:t>Görevi</w:t>
             </w:r>
@@ -147,10 +147,10 @@
           <w:tcPr>
             <w:tcW w:type="dxa" w:w="1584"/>
             <w:tcMar>
-              <w:top w:w="100" w:type="dxa"/>
-              <w:bottom w:w="100" w:type="dxa"/>
-              <w:left w:w="120" w:type="dxa"/>
-              <w:right w:w="120" w:type="dxa"/>
+              <w:top w:w="90" w:type="dxa"/>
+              <w:bottom w:w="90" w:type="dxa"/>
+              <w:left w:w="100" w:type="dxa"/>
+              <w:right w:w="100" w:type="dxa"/>
             </w:tcMar>
             <w:shd w:fill="1A365D"/>
           </w:tcPr>
@@ -163,7 +163,7 @@
                 <w:rFonts w:ascii="Calibri" w:hAnsi="Calibri"/>
                 <w:b/>
                 <w:color w:val="FFFFFF"/>
-                <w:sz w:val="19"/>
+                <w:sz w:val="18"/>
               </w:rPr>
               <w:t>Dil / Framework</w:t>
             </w:r>
@@ -173,10 +173,10 @@
           <w:tcPr>
             <w:tcW w:type="dxa" w:w="1728"/>
             <w:tcMar>
-              <w:top w:w="100" w:type="dxa"/>
-              <w:bottom w:w="100" w:type="dxa"/>
-              <w:left w:w="120" w:type="dxa"/>
-              <w:right w:w="120" w:type="dxa"/>
+              <w:top w:w="90" w:type="dxa"/>
+              <w:bottom w:w="90" w:type="dxa"/>
+              <w:left w:w="100" w:type="dxa"/>
+              <w:right w:w="100" w:type="dxa"/>
             </w:tcMar>
             <w:shd w:fill="1A365D"/>
           </w:tcPr>
@@ -189,7 +189,7 @@
                 <w:rFonts w:ascii="Calibri" w:hAnsi="Calibri"/>
                 <w:b/>
                 <w:color w:val="FFFFFF"/>
-                <w:sz w:val="19"/>
+                <w:sz w:val="18"/>
               </w:rPr>
               <w:t>Kütüphane / Araç</w:t>
             </w:r>
@@ -197,12 +197,12 @@
         </w:tc>
         <w:tc>
           <w:tcPr>
-            <w:tcW w:type="dxa" w:w="1440"/>
+            <w:tcW w:type="dxa" w:w="1728"/>
             <w:tcMar>
-              <w:top w:w="100" w:type="dxa"/>
-              <w:bottom w:w="100" w:type="dxa"/>
-              <w:left w:w="120" w:type="dxa"/>
-              <w:right w:w="120" w:type="dxa"/>
+              <w:top w:w="90" w:type="dxa"/>
+              <w:bottom w:w="90" w:type="dxa"/>
+              <w:left w:w="100" w:type="dxa"/>
+              <w:right w:w="100" w:type="dxa"/>
             </w:tcMar>
             <w:shd w:fill="1A365D"/>
           </w:tcPr>
@@ -215,20 +215,20 @@
                 <w:rFonts w:ascii="Calibri" w:hAnsi="Calibri"/>
                 <w:b/>
                 <w:color w:val="FFFFFF"/>
-                <w:sz w:val="19"/>
+                <w:sz w:val="18"/>
               </w:rPr>
-              <w:t>PoC Servisi ($0)</w:t>
+              <w:t>PoC ($0) / Demo (VPS)</w:t>
             </w:r>
           </w:p>
         </w:tc>
         <w:tc>
           <w:tcPr>
-            <w:tcW w:type="dxa" w:w="1728"/>
+            <w:tcW w:type="dxa" w:w="2016"/>
             <w:tcMar>
-              <w:top w:w="100" w:type="dxa"/>
-              <w:bottom w:w="100" w:type="dxa"/>
-              <w:left w:w="120" w:type="dxa"/>
-              <w:right w:w="120" w:type="dxa"/>
+              <w:top w:w="90" w:type="dxa"/>
+              <w:bottom w:w="90" w:type="dxa"/>
+              <w:left w:w="100" w:type="dxa"/>
+              <w:right w:w="100" w:type="dxa"/>
             </w:tcMar>
             <w:shd w:fill="1A365D"/>
           </w:tcPr>
@@ -241,9 +241,9 @@
                 <w:rFonts w:ascii="Calibri" w:hAnsi="Calibri"/>
                 <w:b/>
                 <w:color w:val="FFFFFF"/>
-                <w:sz w:val="19"/>
+                <w:sz w:val="18"/>
               </w:rPr>
-              <w:t>Azure Enterprise</w:t>
+              <w:t>Kurumsal Satış (Tercihe Göre)</w:t>
             </w:r>
           </w:p>
         </w:tc>
@@ -253,10 +253,10 @@
           <w:tcPr>
             <w:tcW w:type="dxa" w:w="1728"/>
             <w:tcMar>
-              <w:top w:w="100" w:type="dxa"/>
-              <w:bottom w:w="100" w:type="dxa"/>
-              <w:left w:w="120" w:type="dxa"/>
-              <w:right w:w="120" w:type="dxa"/>
+              <w:top w:w="90" w:type="dxa"/>
+              <w:bottom w:w="90" w:type="dxa"/>
+              <w:left w:w="100" w:type="dxa"/>
+              <w:right w:w="100" w:type="dxa"/>
             </w:tcMar>
             <w:shd w:fill="F7FAFC"/>
           </w:tcPr>
@@ -268,7 +268,7 @@
               <w:rPr>
                 <w:rFonts w:ascii="Calibri" w:hAnsi="Calibri"/>
                 <w:color w:val="2D3748"/>
-                <w:sz w:val="17"/>
+                <w:sz w:val="16"/>
               </w:rPr>
               <w:t>1. Sunum / İstemci (Frontend)</w:t>
             </w:r>
@@ -276,12 +276,12 @@
         </w:tc>
         <w:tc>
           <w:tcPr>
-            <w:tcW w:type="dxa" w:w="2160"/>
+            <w:tcW w:type="dxa" w:w="2016"/>
             <w:tcMar>
-              <w:top w:w="100" w:type="dxa"/>
-              <w:bottom w:w="100" w:type="dxa"/>
-              <w:left w:w="120" w:type="dxa"/>
-              <w:right w:w="120" w:type="dxa"/>
+              <w:top w:w="90" w:type="dxa"/>
+              <w:bottom w:w="90" w:type="dxa"/>
+              <w:left w:w="100" w:type="dxa"/>
+              <w:right w:w="100" w:type="dxa"/>
             </w:tcMar>
             <w:shd w:fill="F7FAFC"/>
           </w:tcPr>
@@ -293,7 +293,7 @@
               <w:rPr>
                 <w:rFonts w:ascii="Calibri" w:hAnsi="Calibri"/>
                 <w:color w:val="2D3748"/>
-                <w:sz w:val="17"/>
+                <w:sz w:val="16"/>
               </w:rPr>
               <w:t>Mobil öncelikli responsive PWA arayüzü, hızlı ziyaret formu.</w:t>
             </w:r>
@@ -303,10 +303,10 @@
           <w:tcPr>
             <w:tcW w:type="dxa" w:w="1584"/>
             <w:tcMar>
-              <w:top w:w="100" w:type="dxa"/>
-              <w:bottom w:w="100" w:type="dxa"/>
-              <w:left w:w="120" w:type="dxa"/>
-              <w:right w:w="120" w:type="dxa"/>
+              <w:top w:w="90" w:type="dxa"/>
+              <w:bottom w:w="90" w:type="dxa"/>
+              <w:left w:w="100" w:type="dxa"/>
+              <w:right w:w="100" w:type="dxa"/>
             </w:tcMar>
             <w:shd w:fill="F7FAFC"/>
           </w:tcPr>
@@ -318,7 +318,7 @@
               <w:rPr>
                 <w:rFonts w:ascii="Calibri" w:hAnsi="Calibri"/>
                 <w:color w:val="2D3748"/>
-                <w:sz w:val="17"/>
+                <w:sz w:val="16"/>
               </w:rPr>
               <w:t>TypeScript / React 18+</w:t>
             </w:r>
@@ -328,10 +328,10 @@
           <w:tcPr>
             <w:tcW w:type="dxa" w:w="1728"/>
             <w:tcMar>
-              <w:top w:w="100" w:type="dxa"/>
-              <w:bottom w:w="100" w:type="dxa"/>
-              <w:left w:w="120" w:type="dxa"/>
-              <w:right w:w="120" w:type="dxa"/>
+              <w:top w:w="90" w:type="dxa"/>
+              <w:bottom w:w="90" w:type="dxa"/>
+              <w:left w:w="100" w:type="dxa"/>
+              <w:right w:w="100" w:type="dxa"/>
             </w:tcMar>
             <w:shd w:fill="F7FAFC"/>
           </w:tcPr>
@@ -343,7 +343,7 @@
               <w:rPr>
                 <w:rFonts w:ascii="Calibri" w:hAnsi="Calibri"/>
                 <w:color w:val="2D3748"/>
-                <w:sz w:val="17"/>
+                <w:sz w:val="16"/>
               </w:rPr>
               <w:t>Vite, Tailwind CSS, Lucide, Axios</w:t>
             </w:r>
@@ -351,12 +351,12 @@
         </w:tc>
         <w:tc>
           <w:tcPr>
-            <w:tcW w:type="dxa" w:w="1440"/>
+            <w:tcW w:type="dxa" w:w="1728"/>
             <w:tcMar>
-              <w:top w:w="100" w:type="dxa"/>
-              <w:bottom w:w="100" w:type="dxa"/>
-              <w:left w:w="120" w:type="dxa"/>
-              <w:right w:w="120" w:type="dxa"/>
+              <w:top w:w="90" w:type="dxa"/>
+              <w:bottom w:w="90" w:type="dxa"/>
+              <w:left w:w="100" w:type="dxa"/>
+              <w:right w:w="100" w:type="dxa"/>
             </w:tcMar>
             <w:shd w:fill="F7FAFC"/>
           </w:tcPr>
@@ -368,20 +368,20 @@
               <w:rPr>
                 <w:rFonts w:ascii="Calibri" w:hAnsi="Calibri"/>
                 <w:color w:val="2D3748"/>
-                <w:sz w:val="17"/>
+                <w:sz w:val="16"/>
               </w:rPr>
-              <w:t>Vercel CDN</w:t>
+              <w:t>Vercel CDN / VPS Nginx</w:t>
             </w:r>
           </w:p>
         </w:tc>
         <w:tc>
           <w:tcPr>
-            <w:tcW w:type="dxa" w:w="1728"/>
+            <w:tcW w:type="dxa" w:w="2016"/>
             <w:tcMar>
-              <w:top w:w="100" w:type="dxa"/>
-              <w:bottom w:w="100" w:type="dxa"/>
-              <w:left w:w="120" w:type="dxa"/>
-              <w:right w:w="120" w:type="dxa"/>
+              <w:top w:w="90" w:type="dxa"/>
+              <w:bottom w:w="90" w:type="dxa"/>
+              <w:left w:w="100" w:type="dxa"/>
+              <w:right w:w="100" w:type="dxa"/>
             </w:tcMar>
             <w:shd w:fill="F7FAFC"/>
           </w:tcPr>
@@ -393,9 +393,9 @@
               <w:rPr>
                 <w:rFonts w:ascii="Calibri" w:hAnsi="Calibri"/>
                 <w:color w:val="2D3748"/>
-                <w:sz w:val="17"/>
+                <w:sz w:val="16"/>
               </w:rPr>
-              <w:t>Azure Static Web Apps</w:t>
+              <w:t>VPS Nginx veya Azure Static Web Apps</w:t>
             </w:r>
           </w:p>
         </w:tc>
@@ -405,10 +405,10 @@
           <w:tcPr>
             <w:tcW w:type="dxa" w:w="1728"/>
             <w:tcMar>
-              <w:top w:w="100" w:type="dxa"/>
-              <w:bottom w:w="100" w:type="dxa"/>
-              <w:left w:w="120" w:type="dxa"/>
-              <w:right w:w="120" w:type="dxa"/>
+              <w:top w:w="90" w:type="dxa"/>
+              <w:bottom w:w="90" w:type="dxa"/>
+              <w:left w:w="100" w:type="dxa"/>
+              <w:right w:w="100" w:type="dxa"/>
             </w:tcMar>
             <w:shd w:fill="FFFFFF"/>
           </w:tcPr>
@@ -420,7 +420,7 @@
               <w:rPr>
                 <w:rFonts w:ascii="Calibri" w:hAnsi="Calibri"/>
                 <w:color w:val="2D3748"/>
-                <w:sz w:val="17"/>
+                <w:sz w:val="16"/>
               </w:rPr>
               <w:t>2. API / Denetleyici (Web Layer)</w:t>
             </w:r>
@@ -428,12 +428,12 @@
         </w:tc>
         <w:tc>
           <w:tcPr>
-            <w:tcW w:type="dxa" w:w="2160"/>
+            <w:tcW w:type="dxa" w:w="2016"/>
             <w:tcMar>
-              <w:top w:w="100" w:type="dxa"/>
-              <w:bottom w:w="100" w:type="dxa"/>
-              <w:left w:w="120" w:type="dxa"/>
-              <w:right w:w="120" w:type="dxa"/>
+              <w:top w:w="90" w:type="dxa"/>
+              <w:bottom w:w="90" w:type="dxa"/>
+              <w:left w:w="100" w:type="dxa"/>
+              <w:right w:w="100" w:type="dxa"/>
             </w:tcMar>
             <w:shd w:fill="FFFFFF"/>
           </w:tcPr>
@@ -445,9 +445,9 @@
               <w:rPr>
                 <w:rFonts w:ascii="Calibri" w:hAnsi="Calibri"/>
                 <w:color w:val="2D3748"/>
-                <w:sz w:val="17"/>
+                <w:sz w:val="16"/>
               </w:rPr>
-              <w:t>HTTP istek karşılama, girdi doğrulama, standart JSON yanıtlama.</w:t>
+              <w:t>HTTP istek karşılama, girdi doğrulama, standart JSON yanıt.</w:t>
             </w:r>
           </w:p>
         </w:tc>
@@ -455,10 +455,10 @@
           <w:tcPr>
             <w:tcW w:type="dxa" w:w="1584"/>
             <w:tcMar>
-              <w:top w:w="100" w:type="dxa"/>
-              <w:bottom w:w="100" w:type="dxa"/>
-              <w:left w:w="120" w:type="dxa"/>
-              <w:right w:w="120" w:type="dxa"/>
+              <w:top w:w="90" w:type="dxa"/>
+              <w:bottom w:w="90" w:type="dxa"/>
+              <w:left w:w="100" w:type="dxa"/>
+              <w:right w:w="100" w:type="dxa"/>
             </w:tcMar>
             <w:shd w:fill="FFFFFF"/>
           </w:tcPr>
@@ -470,7 +470,7 @@
               <w:rPr>
                 <w:rFonts w:ascii="Calibri" w:hAnsi="Calibri"/>
                 <w:color w:val="2D3748"/>
-                <w:sz w:val="17"/>
+                <w:sz w:val="16"/>
               </w:rPr>
               <w:t>Java 21</w:t>
             </w:r>
@@ -480,10 +480,10 @@
           <w:tcPr>
             <w:tcW w:type="dxa" w:w="1728"/>
             <w:tcMar>
-              <w:top w:w="100" w:type="dxa"/>
-              <w:bottom w:w="100" w:type="dxa"/>
-              <w:left w:w="120" w:type="dxa"/>
-              <w:right w:w="120" w:type="dxa"/>
+              <w:top w:w="90" w:type="dxa"/>
+              <w:bottom w:w="90" w:type="dxa"/>
+              <w:left w:w="100" w:type="dxa"/>
+              <w:right w:w="100" w:type="dxa"/>
             </w:tcMar>
             <w:shd w:fill="FFFFFF"/>
           </w:tcPr>
@@ -495,7 +495,7 @@
               <w:rPr>
                 <w:rFonts w:ascii="Calibri" w:hAnsi="Calibri"/>
                 <w:color w:val="2D3748"/>
-                <w:sz w:val="17"/>
+                <w:sz w:val="16"/>
               </w:rPr>
               <w:t>Spring Boot Web, Jakarta Validation</w:t>
             </w:r>
@@ -503,12 +503,12 @@
         </w:tc>
         <w:tc>
           <w:tcPr>
-            <w:tcW w:type="dxa" w:w="1440"/>
+            <w:tcW w:type="dxa" w:w="1728"/>
             <w:tcMar>
-              <w:top w:w="100" w:type="dxa"/>
-              <w:bottom w:w="100" w:type="dxa"/>
-              <w:left w:w="120" w:type="dxa"/>
-              <w:right w:w="120" w:type="dxa"/>
+              <w:top w:w="90" w:type="dxa"/>
+              <w:bottom w:w="90" w:type="dxa"/>
+              <w:left w:w="100" w:type="dxa"/>
+              <w:right w:w="100" w:type="dxa"/>
             </w:tcMar>
             <w:shd w:fill="FFFFFF"/>
           </w:tcPr>
@@ -520,20 +520,20 @@
               <w:rPr>
                 <w:rFonts w:ascii="Calibri" w:hAnsi="Calibri"/>
                 <w:color w:val="2D3748"/>
-                <w:sz w:val="17"/>
+                <w:sz w:val="16"/>
               </w:rPr>
-              <w:t>Render Web Service</w:t>
+              <w:t>Render / VPS Docker</w:t>
             </w:r>
           </w:p>
         </w:tc>
         <w:tc>
           <w:tcPr>
-            <w:tcW w:type="dxa" w:w="1728"/>
+            <w:tcW w:type="dxa" w:w="2016"/>
             <w:tcMar>
-              <w:top w:w="100" w:type="dxa"/>
-              <w:bottom w:w="100" w:type="dxa"/>
-              <w:left w:w="120" w:type="dxa"/>
-              <w:right w:w="120" w:type="dxa"/>
+              <w:top w:w="90" w:type="dxa"/>
+              <w:bottom w:w="90" w:type="dxa"/>
+              <w:left w:w="100" w:type="dxa"/>
+              <w:right w:w="100" w:type="dxa"/>
             </w:tcMar>
             <w:shd w:fill="FFFFFF"/>
           </w:tcPr>
@@ -545,9 +545,9 @@
               <w:rPr>
                 <w:rFonts w:ascii="Calibri" w:hAnsi="Calibri"/>
                 <w:color w:val="2D3748"/>
-                <w:sz w:val="17"/>
+                <w:sz w:val="16"/>
               </w:rPr>
-              <w:t>Azure Container Apps</w:t>
+              <w:t>VPS Docker veya Azure Container Apps</w:t>
             </w:r>
           </w:p>
         </w:tc>
@@ -557,10 +557,10 @@
           <w:tcPr>
             <w:tcW w:type="dxa" w:w="1728"/>
             <w:tcMar>
-              <w:top w:w="100" w:type="dxa"/>
-              <w:bottom w:w="100" w:type="dxa"/>
-              <w:left w:w="120" w:type="dxa"/>
-              <w:right w:w="120" w:type="dxa"/>
+              <w:top w:w="90" w:type="dxa"/>
+              <w:bottom w:w="90" w:type="dxa"/>
+              <w:left w:w="100" w:type="dxa"/>
+              <w:right w:w="100" w:type="dxa"/>
             </w:tcMar>
             <w:shd w:fill="F7FAFC"/>
           </w:tcPr>
@@ -572,7 +572,7 @@
               <w:rPr>
                 <w:rFonts w:ascii="Calibri" w:hAnsi="Calibri"/>
                 <w:color w:val="2D3748"/>
-                <w:sz w:val="17"/>
+                <w:sz w:val="16"/>
               </w:rPr>
               <w:t>3. Güvenlik &amp; Yetkilendirme</w:t>
             </w:r>
@@ -580,12 +580,12 @@
         </w:tc>
         <w:tc>
           <w:tcPr>
-            <w:tcW w:type="dxa" w:w="2160"/>
+            <w:tcW w:type="dxa" w:w="2016"/>
             <w:tcMar>
-              <w:top w:w="100" w:type="dxa"/>
-              <w:bottom w:w="100" w:type="dxa"/>
-              <w:left w:w="120" w:type="dxa"/>
-              <w:right w:w="120" w:type="dxa"/>
+              <w:top w:w="90" w:type="dxa"/>
+              <w:bottom w:w="90" w:type="dxa"/>
+              <w:left w:w="100" w:type="dxa"/>
+              <w:right w:w="100" w:type="dxa"/>
             </w:tcMar>
             <w:shd w:fill="F7FAFC"/>
           </w:tcPr>
@@ -597,7 +597,7 @@
               <w:rPr>
                 <w:rFonts w:ascii="Calibri" w:hAnsi="Calibri"/>
                 <w:color w:val="2D3748"/>
-                <w:sz w:val="17"/>
+                <w:sz w:val="16"/>
               </w:rPr>
               <w:t>Stateless JWT, BCrypt, RBAC (ADMIN/SALES_REP) ve veri izolasyonu.</w:t>
             </w:r>
@@ -607,10 +607,10 @@
           <w:tcPr>
             <w:tcW w:type="dxa" w:w="1584"/>
             <w:tcMar>
-              <w:top w:w="100" w:type="dxa"/>
-              <w:bottom w:w="100" w:type="dxa"/>
-              <w:left w:w="120" w:type="dxa"/>
-              <w:right w:w="120" w:type="dxa"/>
+              <w:top w:w="90" w:type="dxa"/>
+              <w:bottom w:w="90" w:type="dxa"/>
+              <w:left w:w="100" w:type="dxa"/>
+              <w:right w:w="100" w:type="dxa"/>
             </w:tcMar>
             <w:shd w:fill="F7FAFC"/>
           </w:tcPr>
@@ -622,7 +622,7 @@
               <w:rPr>
                 <w:rFonts w:ascii="Calibri" w:hAnsi="Calibri"/>
                 <w:color w:val="2D3748"/>
-                <w:sz w:val="17"/>
+                <w:sz w:val="16"/>
               </w:rPr>
               <w:t>Java 21</w:t>
             </w:r>
@@ -632,10 +632,10 @@
           <w:tcPr>
             <w:tcW w:type="dxa" w:w="1728"/>
             <w:tcMar>
-              <w:top w:w="100" w:type="dxa"/>
-              <w:bottom w:w="100" w:type="dxa"/>
-              <w:left w:w="120" w:type="dxa"/>
-              <w:right w:w="120" w:type="dxa"/>
+              <w:top w:w="90" w:type="dxa"/>
+              <w:bottom w:w="90" w:type="dxa"/>
+              <w:left w:w="100" w:type="dxa"/>
+              <w:right w:w="100" w:type="dxa"/>
             </w:tcMar>
             <w:shd w:fill="F7FAFC"/>
           </w:tcPr>
@@ -647,7 +647,7 @@
               <w:rPr>
                 <w:rFonts w:ascii="Calibri" w:hAnsi="Calibri"/>
                 <w:color w:val="2D3748"/>
-                <w:sz w:val="17"/>
+                <w:sz w:val="16"/>
               </w:rPr>
               <w:t>Spring Security 6, jjwt-api, BCrypt</w:t>
             </w:r>
@@ -655,12 +655,12 @@
         </w:tc>
         <w:tc>
           <w:tcPr>
-            <w:tcW w:type="dxa" w:w="1440"/>
+            <w:tcW w:type="dxa" w:w="1728"/>
             <w:tcMar>
-              <w:top w:w="100" w:type="dxa"/>
-              <w:bottom w:w="100" w:type="dxa"/>
-              <w:left w:w="120" w:type="dxa"/>
-              <w:right w:w="120" w:type="dxa"/>
+              <w:top w:w="90" w:type="dxa"/>
+              <w:bottom w:w="90" w:type="dxa"/>
+              <w:left w:w="100" w:type="dxa"/>
+              <w:right w:w="100" w:type="dxa"/>
             </w:tcMar>
             <w:shd w:fill="F7FAFC"/>
           </w:tcPr>
@@ -672,20 +672,20 @@
               <w:rPr>
                 <w:rFonts w:ascii="Calibri" w:hAnsi="Calibri"/>
                 <w:color w:val="2D3748"/>
-                <w:sz w:val="17"/>
+                <w:sz w:val="16"/>
               </w:rPr>
-              <w:t>Render Runtime</w:t>
+              <w:t>Render / VPS Runtime</w:t>
             </w:r>
           </w:p>
         </w:tc>
         <w:tc>
           <w:tcPr>
-            <w:tcW w:type="dxa" w:w="1728"/>
+            <w:tcW w:type="dxa" w:w="2016"/>
             <w:tcMar>
-              <w:top w:w="100" w:type="dxa"/>
-              <w:bottom w:w="100" w:type="dxa"/>
-              <w:left w:w="120" w:type="dxa"/>
-              <w:right w:w="120" w:type="dxa"/>
+              <w:top w:w="90" w:type="dxa"/>
+              <w:bottom w:w="90" w:type="dxa"/>
+              <w:left w:w="100" w:type="dxa"/>
+              <w:right w:w="100" w:type="dxa"/>
             </w:tcMar>
             <w:shd w:fill="F7FAFC"/>
           </w:tcPr>
@@ -697,9 +697,9 @@
               <w:rPr>
                 <w:rFonts w:ascii="Calibri" w:hAnsi="Calibri"/>
                 <w:color w:val="2D3748"/>
-                <w:sz w:val="17"/>
+                <w:sz w:val="16"/>
               </w:rPr>
-              <w:t>Azure Container Apps + Key Vault</w:t>
+              <w:t>VPS Docker veya Azure + Key Vault</w:t>
             </w:r>
           </w:p>
         </w:tc>
@@ -709,10 +709,10 @@
           <w:tcPr>
             <w:tcW w:type="dxa" w:w="1728"/>
             <w:tcMar>
-              <w:top w:w="100" w:type="dxa"/>
-              <w:bottom w:w="100" w:type="dxa"/>
-              <w:left w:w="120" w:type="dxa"/>
-              <w:right w:w="120" w:type="dxa"/>
+              <w:top w:w="90" w:type="dxa"/>
+              <w:bottom w:w="90" w:type="dxa"/>
+              <w:left w:w="100" w:type="dxa"/>
+              <w:right w:w="100" w:type="dxa"/>
             </w:tcMar>
             <w:shd w:fill="FFFFFF"/>
           </w:tcPr>
@@ -724,7 +724,7 @@
               <w:rPr>
                 <w:rFonts w:ascii="Calibri" w:hAnsi="Calibri"/>
                 <w:color w:val="2D3748"/>
-                <w:sz w:val="17"/>
+                <w:sz w:val="16"/>
               </w:rPr>
               <w:t>4. İş Mantığı (Business Layer)</w:t>
             </w:r>
@@ -732,12 +732,12 @@
         </w:tc>
         <w:tc>
           <w:tcPr>
-            <w:tcW w:type="dxa" w:w="2160"/>
+            <w:tcW w:type="dxa" w:w="2016"/>
             <w:tcMar>
-              <w:top w:w="100" w:type="dxa"/>
-              <w:bottom w:w="100" w:type="dxa"/>
-              <w:left w:w="120" w:type="dxa"/>
-              <w:right w:w="120" w:type="dxa"/>
+              <w:top w:w="90" w:type="dxa"/>
+              <w:bottom w:w="90" w:type="dxa"/>
+              <w:left w:w="100" w:type="dxa"/>
+              <w:right w:w="100" w:type="dxa"/>
             </w:tcMar>
             <w:shd w:fill="FFFFFF"/>
           </w:tcPr>
@@ -749,9 +749,9 @@
               <w:rPr>
                 <w:rFonts w:ascii="Calibri" w:hAnsi="Calibri"/>
                 <w:color w:val="2D3748"/>
-                <w:sz w:val="17"/>
+                <w:sz w:val="16"/>
               </w:rPr>
-              <w:t>17 kolonu yöneten kurallar, ziyaret-numune-teklif yaşam döngüsü.</w:t>
+              <w:t>17 kolonu yöneten kurallar, ziyaret-numune-teklif döngüsü.</w:t>
             </w:r>
           </w:p>
         </w:tc>
@@ -759,10 +759,10 @@
           <w:tcPr>
             <w:tcW w:type="dxa" w:w="1584"/>
             <w:tcMar>
-              <w:top w:w="100" w:type="dxa"/>
-              <w:bottom w:w="100" w:type="dxa"/>
-              <w:left w:w="120" w:type="dxa"/>
-              <w:right w:w="120" w:type="dxa"/>
+              <w:top w:w="90" w:type="dxa"/>
+              <w:bottom w:w="90" w:type="dxa"/>
+              <w:left w:w="100" w:type="dxa"/>
+              <w:right w:w="100" w:type="dxa"/>
             </w:tcMar>
             <w:shd w:fill="FFFFFF"/>
           </w:tcPr>
@@ -774,7 +774,7 @@
               <w:rPr>
                 <w:rFonts w:ascii="Calibri" w:hAnsi="Calibri"/>
                 <w:color w:val="2D3748"/>
-                <w:sz w:val="17"/>
+                <w:sz w:val="16"/>
               </w:rPr>
               <w:t>Java 21</w:t>
             </w:r>
@@ -784,10 +784,10 @@
           <w:tcPr>
             <w:tcW w:type="dxa" w:w="1728"/>
             <w:tcMar>
-              <w:top w:w="100" w:type="dxa"/>
-              <w:bottom w:w="100" w:type="dxa"/>
-              <w:left w:w="120" w:type="dxa"/>
-              <w:right w:w="120" w:type="dxa"/>
+              <w:top w:w="90" w:type="dxa"/>
+              <w:bottom w:w="90" w:type="dxa"/>
+              <w:left w:w="100" w:type="dxa"/>
+              <w:right w:w="100" w:type="dxa"/>
             </w:tcMar>
             <w:shd w:fill="FFFFFF"/>
           </w:tcPr>
@@ -799,7 +799,7 @@
               <w:rPr>
                 <w:rFonts w:ascii="Calibri" w:hAnsi="Calibri"/>
                 <w:color w:val="2D3748"/>
-                <w:sz w:val="17"/>
+                <w:sz w:val="16"/>
               </w:rPr>
               <w:t>Spring Services (@Service, @Transactional)</w:t>
             </w:r>
@@ -807,12 +807,12 @@
         </w:tc>
         <w:tc>
           <w:tcPr>
-            <w:tcW w:type="dxa" w:w="1440"/>
+            <w:tcW w:type="dxa" w:w="1728"/>
             <w:tcMar>
-              <w:top w:w="100" w:type="dxa"/>
-              <w:bottom w:w="100" w:type="dxa"/>
-              <w:left w:w="120" w:type="dxa"/>
-              <w:right w:w="120" w:type="dxa"/>
+              <w:top w:w="90" w:type="dxa"/>
+              <w:bottom w:w="90" w:type="dxa"/>
+              <w:left w:w="100" w:type="dxa"/>
+              <w:right w:w="100" w:type="dxa"/>
             </w:tcMar>
             <w:shd w:fill="FFFFFF"/>
           </w:tcPr>
@@ -824,20 +824,20 @@
               <w:rPr>
                 <w:rFonts w:ascii="Calibri" w:hAnsi="Calibri"/>
                 <w:color w:val="2D3748"/>
-                <w:sz w:val="17"/>
+                <w:sz w:val="16"/>
               </w:rPr>
-              <w:t>Render Runtime</w:t>
+              <w:t>Render / VPS Runtime</w:t>
             </w:r>
           </w:p>
         </w:tc>
         <w:tc>
           <w:tcPr>
-            <w:tcW w:type="dxa" w:w="1728"/>
+            <w:tcW w:type="dxa" w:w="2016"/>
             <w:tcMar>
-              <w:top w:w="100" w:type="dxa"/>
-              <w:bottom w:w="100" w:type="dxa"/>
-              <w:left w:w="120" w:type="dxa"/>
-              <w:right w:w="120" w:type="dxa"/>
+              <w:top w:w="90" w:type="dxa"/>
+              <w:bottom w:w="90" w:type="dxa"/>
+              <w:left w:w="100" w:type="dxa"/>
+              <w:right w:w="100" w:type="dxa"/>
             </w:tcMar>
             <w:shd w:fill="FFFFFF"/>
           </w:tcPr>
@@ -849,9 +849,9 @@
               <w:rPr>
                 <w:rFonts w:ascii="Calibri" w:hAnsi="Calibri"/>
                 <w:color w:val="2D3748"/>
-                <w:sz w:val="17"/>
+                <w:sz w:val="16"/>
               </w:rPr>
-              <w:t>Azure Container Apps</w:t>
+              <w:t>VPS Docker veya Azure Container Apps</w:t>
             </w:r>
           </w:p>
         </w:tc>
@@ -861,10 +861,10 @@
           <w:tcPr>
             <w:tcW w:type="dxa" w:w="1728"/>
             <w:tcMar>
-              <w:top w:w="100" w:type="dxa"/>
-              <w:bottom w:w="100" w:type="dxa"/>
-              <w:left w:w="120" w:type="dxa"/>
-              <w:right w:w="120" w:type="dxa"/>
+              <w:top w:w="90" w:type="dxa"/>
+              <w:bottom w:w="90" w:type="dxa"/>
+              <w:left w:w="100" w:type="dxa"/>
+              <w:right w:w="100" w:type="dxa"/>
             </w:tcMar>
             <w:shd w:fill="F7FAFC"/>
           </w:tcPr>
@@ -876,7 +876,7 @@
               <w:rPr>
                 <w:rFonts w:ascii="Calibri" w:hAnsi="Calibri"/>
                 <w:color w:val="2D3748"/>
-                <w:sz w:val="17"/>
+                <w:sz w:val="16"/>
               </w:rPr>
               <w:t>5. Excel &amp; Dosya İşleme</w:t>
             </w:r>
@@ -884,12 +884,12 @@
         </w:tc>
         <w:tc>
           <w:tcPr>
-            <w:tcW w:type="dxa" w:w="2160"/>
+            <w:tcW w:type="dxa" w:w="2016"/>
             <w:tcMar>
-              <w:top w:w="100" w:type="dxa"/>
-              <w:bottom w:w="100" w:type="dxa"/>
-              <w:left w:w="120" w:type="dxa"/>
-              <w:right w:w="120" w:type="dxa"/>
+              <w:top w:w="90" w:type="dxa"/>
+              <w:bottom w:w="90" w:type="dxa"/>
+              <w:left w:w="100" w:type="dxa"/>
+              <w:right w:w="100" w:type="dxa"/>
             </w:tcMar>
             <w:shd w:fill="F7FAFC"/>
           </w:tcPr>
@@ -901,9 +901,9 @@
               <w:rPr>
                 <w:rFonts w:ascii="Calibri" w:hAnsi="Calibri"/>
                 <w:color w:val="2D3748"/>
-                <w:sz w:val="17"/>
+                <w:sz w:val="16"/>
               </w:rPr>
-              <w:t>Saha Excel'lerini içe aktarma (Import) ve 17 kolonluk dışa aktarma (Export).</w:t>
+              <w:t>Saha Excel'lerini içeri aktarma (Import) ve 17 kolonluk dışarı aktarma (Export).</w:t>
             </w:r>
           </w:p>
         </w:tc>
@@ -911,10 +911,10 @@
           <w:tcPr>
             <w:tcW w:type="dxa" w:w="1584"/>
             <w:tcMar>
-              <w:top w:w="100" w:type="dxa"/>
-              <w:bottom w:w="100" w:type="dxa"/>
-              <w:left w:w="120" w:type="dxa"/>
-              <w:right w:w="120" w:type="dxa"/>
+              <w:top w:w="90" w:type="dxa"/>
+              <w:bottom w:w="90" w:type="dxa"/>
+              <w:left w:w="100" w:type="dxa"/>
+              <w:right w:w="100" w:type="dxa"/>
             </w:tcMar>
             <w:shd w:fill="F7FAFC"/>
           </w:tcPr>
@@ -926,7 +926,7 @@
               <w:rPr>
                 <w:rFonts w:ascii="Calibri" w:hAnsi="Calibri"/>
                 <w:color w:val="2D3748"/>
-                <w:sz w:val="17"/>
+                <w:sz w:val="16"/>
               </w:rPr>
               <w:t>Java 21</w:t>
             </w:r>
@@ -936,10 +936,10 @@
           <w:tcPr>
             <w:tcW w:type="dxa" w:w="1728"/>
             <w:tcMar>
-              <w:top w:w="100" w:type="dxa"/>
-              <w:bottom w:w="100" w:type="dxa"/>
-              <w:left w:w="120" w:type="dxa"/>
-              <w:right w:w="120" w:type="dxa"/>
+              <w:top w:w="90" w:type="dxa"/>
+              <w:bottom w:w="90" w:type="dxa"/>
+              <w:left w:w="100" w:type="dxa"/>
+              <w:right w:w="100" w:type="dxa"/>
             </w:tcMar>
             <w:shd w:fill="F7FAFC"/>
           </w:tcPr>
@@ -951,7 +951,7 @@
               <w:rPr>
                 <w:rFonts w:ascii="Calibri" w:hAnsi="Calibri"/>
                 <w:color w:val="2D3748"/>
-                <w:sz w:val="17"/>
+                <w:sz w:val="16"/>
               </w:rPr>
               <w:t>Apache POI (SXSSFWorkbook streaming)</w:t>
             </w:r>
@@ -959,12 +959,12 @@
         </w:tc>
         <w:tc>
           <w:tcPr>
-            <w:tcW w:type="dxa" w:w="1440"/>
+            <w:tcW w:type="dxa" w:w="1728"/>
             <w:tcMar>
-              <w:top w:w="100" w:type="dxa"/>
-              <w:bottom w:w="100" w:type="dxa"/>
-              <w:left w:w="120" w:type="dxa"/>
-              <w:right w:w="120" w:type="dxa"/>
+              <w:top w:w="90" w:type="dxa"/>
+              <w:bottom w:w="90" w:type="dxa"/>
+              <w:left w:w="100" w:type="dxa"/>
+              <w:right w:w="100" w:type="dxa"/>
             </w:tcMar>
             <w:shd w:fill="F7FAFC"/>
           </w:tcPr>
@@ -976,20 +976,20 @@
               <w:rPr>
                 <w:rFonts w:ascii="Calibri" w:hAnsi="Calibri"/>
                 <w:color w:val="2D3748"/>
-                <w:sz w:val="17"/>
+                <w:sz w:val="16"/>
               </w:rPr>
-              <w:t>Render Bellek Akışı</w:t>
+              <w:t>Bellek İçi Akış</w:t>
             </w:r>
           </w:p>
         </w:tc>
         <w:tc>
           <w:tcPr>
-            <w:tcW w:type="dxa" w:w="1728"/>
+            <w:tcW w:type="dxa" w:w="2016"/>
             <w:tcMar>
-              <w:top w:w="100" w:type="dxa"/>
-              <w:bottom w:w="100" w:type="dxa"/>
-              <w:left w:w="120" w:type="dxa"/>
-              <w:right w:w="120" w:type="dxa"/>
+              <w:top w:w="90" w:type="dxa"/>
+              <w:bottom w:w="90" w:type="dxa"/>
+              <w:left w:w="100" w:type="dxa"/>
+              <w:right w:w="100" w:type="dxa"/>
             </w:tcMar>
             <w:shd w:fill="F7FAFC"/>
           </w:tcPr>
@@ -1001,9 +1001,9 @@
               <w:rPr>
                 <w:rFonts w:ascii="Calibri" w:hAnsi="Calibri"/>
                 <w:color w:val="2D3748"/>
-                <w:sz w:val="17"/>
+                <w:sz w:val="16"/>
               </w:rPr>
-              <w:t>Azure Apps + Blob Storage</w:t>
+              <w:t>VPS Disk veya Azure Blob Storage</w:t>
             </w:r>
           </w:p>
         </w:tc>
@@ -1013,10 +1013,10 @@
           <w:tcPr>
             <w:tcW w:type="dxa" w:w="1728"/>
             <w:tcMar>
-              <w:top w:w="100" w:type="dxa"/>
-              <w:bottom w:w="100" w:type="dxa"/>
-              <w:left w:w="120" w:type="dxa"/>
-              <w:right w:w="120" w:type="dxa"/>
+              <w:top w:w="90" w:type="dxa"/>
+              <w:bottom w:w="90" w:type="dxa"/>
+              <w:left w:w="100" w:type="dxa"/>
+              <w:right w:w="100" w:type="dxa"/>
             </w:tcMar>
             <w:shd w:fill="FFFFFF"/>
           </w:tcPr>
@@ -1028,7 +1028,7 @@
               <w:rPr>
                 <w:rFonts w:ascii="Calibri" w:hAnsi="Calibri"/>
                 <w:color w:val="2D3748"/>
-                <w:sz w:val="17"/>
+                <w:sz w:val="16"/>
               </w:rPr>
               <w:t>6. Kalıcılık / Veri Erişimi (ORM)</w:t>
             </w:r>
@@ -1036,12 +1036,12 @@
         </w:tc>
         <w:tc>
           <w:tcPr>
-            <w:tcW w:type="dxa" w:w="2160"/>
+            <w:tcW w:type="dxa" w:w="2016"/>
             <w:tcMar>
-              <w:top w:w="100" w:type="dxa"/>
-              <w:bottom w:w="100" w:type="dxa"/>
-              <w:left w:w="120" w:type="dxa"/>
-              <w:right w:w="120" w:type="dxa"/>
+              <w:top w:w="90" w:type="dxa"/>
+              <w:bottom w:w="90" w:type="dxa"/>
+              <w:left w:w="100" w:type="dxa"/>
+              <w:right w:w="100" w:type="dxa"/>
             </w:tcMar>
             <w:shd w:fill="FFFFFF"/>
           </w:tcPr>
@@ -1053,7 +1053,7 @@
               <w:rPr>
                 <w:rFonts w:ascii="Calibri" w:hAnsi="Calibri"/>
                 <w:color w:val="2D3748"/>
-                <w:sz w:val="17"/>
+                <w:sz w:val="16"/>
               </w:rPr>
               <w:t>Parametrik SQL sorguları, ORM ilişkileri, temsilci izolasyon filtreleri.</w:t>
             </w:r>
@@ -1063,10 +1063,10 @@
           <w:tcPr>
             <w:tcW w:type="dxa" w:w="1584"/>
             <w:tcMar>
-              <w:top w:w="100" w:type="dxa"/>
-              <w:bottom w:w="100" w:type="dxa"/>
-              <w:left w:w="120" w:type="dxa"/>
-              <w:right w:w="120" w:type="dxa"/>
+              <w:top w:w="90" w:type="dxa"/>
+              <w:bottom w:w="90" w:type="dxa"/>
+              <w:left w:w="100" w:type="dxa"/>
+              <w:right w:w="100" w:type="dxa"/>
             </w:tcMar>
             <w:shd w:fill="FFFFFF"/>
           </w:tcPr>
@@ -1078,7 +1078,7 @@
               <w:rPr>
                 <w:rFonts w:ascii="Calibri" w:hAnsi="Calibri"/>
                 <w:color w:val="2D3748"/>
-                <w:sz w:val="17"/>
+                <w:sz w:val="16"/>
               </w:rPr>
               <w:t>Java 21</w:t>
             </w:r>
@@ -1088,10 +1088,10 @@
           <w:tcPr>
             <w:tcW w:type="dxa" w:w="1728"/>
             <w:tcMar>
-              <w:top w:w="100" w:type="dxa"/>
-              <w:bottom w:w="100" w:type="dxa"/>
-              <w:left w:w="120" w:type="dxa"/>
-              <w:right w:w="120" w:type="dxa"/>
+              <w:top w:w="90" w:type="dxa"/>
+              <w:bottom w:w="90" w:type="dxa"/>
+              <w:left w:w="100" w:type="dxa"/>
+              <w:right w:w="100" w:type="dxa"/>
             </w:tcMar>
             <w:shd w:fill="FFFFFF"/>
           </w:tcPr>
@@ -1103,7 +1103,7 @@
               <w:rPr>
                 <w:rFonts w:ascii="Calibri" w:hAnsi="Calibri"/>
                 <w:color w:val="2D3748"/>
-                <w:sz w:val="17"/>
+                <w:sz w:val="16"/>
               </w:rPr>
               <w:t>Spring Data JPA, Hibernate, HikariCP</w:t>
             </w:r>
@@ -1111,12 +1111,12 @@
         </w:tc>
         <w:tc>
           <w:tcPr>
-            <w:tcW w:type="dxa" w:w="1440"/>
+            <w:tcW w:type="dxa" w:w="1728"/>
             <w:tcMar>
-              <w:top w:w="100" w:type="dxa"/>
-              <w:bottom w:w="100" w:type="dxa"/>
-              <w:left w:w="120" w:type="dxa"/>
-              <w:right w:w="120" w:type="dxa"/>
+              <w:top w:w="90" w:type="dxa"/>
+              <w:bottom w:w="90" w:type="dxa"/>
+              <w:left w:w="100" w:type="dxa"/>
+              <w:right w:w="100" w:type="dxa"/>
             </w:tcMar>
             <w:shd w:fill="FFFFFF"/>
           </w:tcPr>
@@ -1128,20 +1128,20 @@
               <w:rPr>
                 <w:rFonts w:ascii="Calibri" w:hAnsi="Calibri"/>
                 <w:color w:val="2D3748"/>
-                <w:sz w:val="17"/>
+                <w:sz w:val="16"/>
               </w:rPr>
-              <w:t>Render Runtime</w:t>
+              <w:t>Render / VPS Runtime</w:t>
             </w:r>
           </w:p>
         </w:tc>
         <w:tc>
           <w:tcPr>
-            <w:tcW w:type="dxa" w:w="1728"/>
+            <w:tcW w:type="dxa" w:w="2016"/>
             <w:tcMar>
-              <w:top w:w="100" w:type="dxa"/>
-              <w:bottom w:w="100" w:type="dxa"/>
-              <w:left w:w="120" w:type="dxa"/>
-              <w:right w:w="120" w:type="dxa"/>
+              <w:top w:w="90" w:type="dxa"/>
+              <w:bottom w:w="90" w:type="dxa"/>
+              <w:left w:w="100" w:type="dxa"/>
+              <w:right w:w="100" w:type="dxa"/>
             </w:tcMar>
             <w:shd w:fill="FFFFFF"/>
           </w:tcPr>
@@ -1153,9 +1153,9 @@
               <w:rPr>
                 <w:rFonts w:ascii="Calibri" w:hAnsi="Calibri"/>
                 <w:color w:val="2D3748"/>
-                <w:sz w:val="17"/>
+                <w:sz w:val="16"/>
               </w:rPr>
-              <w:t>Azure Container Apps</w:t>
+              <w:t>VPS Docker veya Azure Container Apps</w:t>
             </w:r>
           </w:p>
         </w:tc>
@@ -1165,10 +1165,10 @@
           <w:tcPr>
             <w:tcW w:type="dxa" w:w="1728"/>
             <w:tcMar>
-              <w:top w:w="100" w:type="dxa"/>
-              <w:bottom w:w="100" w:type="dxa"/>
-              <w:left w:w="120" w:type="dxa"/>
-              <w:right w:w="120" w:type="dxa"/>
+              <w:top w:w="90" w:type="dxa"/>
+              <w:bottom w:w="90" w:type="dxa"/>
+              <w:left w:w="100" w:type="dxa"/>
+              <w:right w:w="100" w:type="dxa"/>
             </w:tcMar>
             <w:shd w:fill="F7FAFC"/>
           </w:tcPr>
@@ -1180,7 +1180,7 @@
               <w:rPr>
                 <w:rFonts w:ascii="Calibri" w:hAnsi="Calibri"/>
                 <w:color w:val="2D3748"/>
-                <w:sz w:val="17"/>
+                <w:sz w:val="16"/>
               </w:rPr>
               <w:t>7. Veritabanı &amp; Şema Sürümleme</w:t>
             </w:r>
@@ -1188,12 +1188,12 @@
         </w:tc>
         <w:tc>
           <w:tcPr>
-            <w:tcW w:type="dxa" w:w="2160"/>
+            <w:tcW w:type="dxa" w:w="2016"/>
             <w:tcMar>
-              <w:top w:w="100" w:type="dxa"/>
-              <w:bottom w:w="100" w:type="dxa"/>
-              <w:left w:w="120" w:type="dxa"/>
-              <w:right w:w="120" w:type="dxa"/>
+              <w:top w:w="90" w:type="dxa"/>
+              <w:bottom w:w="90" w:type="dxa"/>
+              <w:left w:w="100" w:type="dxa"/>
+              <w:right w:w="100" w:type="dxa"/>
             </w:tcMar>
             <w:shd w:fill="F7FAFC"/>
           </w:tcPr>
@@ -1205,7 +1205,7 @@
               <w:rPr>
                 <w:rFonts w:ascii="Calibri" w:hAnsi="Calibri"/>
                 <w:color w:val="2D3748"/>
-                <w:sz w:val="17"/>
+                <w:sz w:val="16"/>
               </w:rPr>
               <w:t>ACID uyumlu ilişkisel veri, Flyway ile otomatik tablo göçü.</w:t>
             </w:r>
@@ -1215,10 +1215,10 @@
           <w:tcPr>
             <w:tcW w:type="dxa" w:w="1584"/>
             <w:tcMar>
-              <w:top w:w="100" w:type="dxa"/>
-              <w:bottom w:w="100" w:type="dxa"/>
-              <w:left w:w="120" w:type="dxa"/>
-              <w:right w:w="120" w:type="dxa"/>
+              <w:top w:w="90" w:type="dxa"/>
+              <w:bottom w:w="90" w:type="dxa"/>
+              <w:left w:w="100" w:type="dxa"/>
+              <w:right w:w="100" w:type="dxa"/>
             </w:tcMar>
             <w:shd w:fill="F7FAFC"/>
           </w:tcPr>
@@ -1230,7 +1230,7 @@
               <w:rPr>
                 <w:rFonts w:ascii="Calibri" w:hAnsi="Calibri"/>
                 <w:color w:val="2D3748"/>
-                <w:sz w:val="17"/>
+                <w:sz w:val="16"/>
               </w:rPr>
               <w:t>SQL</w:t>
             </w:r>
@@ -1240,10 +1240,10 @@
           <w:tcPr>
             <w:tcW w:type="dxa" w:w="1728"/>
             <w:tcMar>
-              <w:top w:w="100" w:type="dxa"/>
-              <w:bottom w:w="100" w:type="dxa"/>
-              <w:left w:w="120" w:type="dxa"/>
-              <w:right w:w="120" w:type="dxa"/>
+              <w:top w:w="90" w:type="dxa"/>
+              <w:bottom w:w="90" w:type="dxa"/>
+              <w:left w:w="100" w:type="dxa"/>
+              <w:right w:w="100" w:type="dxa"/>
             </w:tcMar>
             <w:shd w:fill="F7FAFC"/>
           </w:tcPr>
@@ -1255,7 +1255,7 @@
               <w:rPr>
                 <w:rFonts w:ascii="Calibri" w:hAnsi="Calibri"/>
                 <w:color w:val="2D3748"/>
-                <w:sz w:val="17"/>
+                <w:sz w:val="16"/>
               </w:rPr>
               <w:t>Flyway Migration, PostgreSQL 15+</w:t>
             </w:r>
@@ -1263,12 +1263,12 @@
         </w:tc>
         <w:tc>
           <w:tcPr>
-            <w:tcW w:type="dxa" w:w="1440"/>
+            <w:tcW w:type="dxa" w:w="1728"/>
             <w:tcMar>
-              <w:top w:w="100" w:type="dxa"/>
-              <w:bottom w:w="100" w:type="dxa"/>
-              <w:left w:w="120" w:type="dxa"/>
-              <w:right w:w="120" w:type="dxa"/>
+              <w:top w:w="90" w:type="dxa"/>
+              <w:bottom w:w="90" w:type="dxa"/>
+              <w:left w:w="100" w:type="dxa"/>
+              <w:right w:w="100" w:type="dxa"/>
             </w:tcMar>
             <w:shd w:fill="F7FAFC"/>
           </w:tcPr>
@@ -1280,20 +1280,20 @@
               <w:rPr>
                 <w:rFonts w:ascii="Calibri" w:hAnsi="Calibri"/>
                 <w:color w:val="2D3748"/>
-                <w:sz w:val="17"/>
+                <w:sz w:val="16"/>
               </w:rPr>
-              <w:t>Supabase Free Tier</w:t>
+              <w:t>Supabase ($0) / VPS PostgreSQL</w:t>
             </w:r>
           </w:p>
         </w:tc>
         <w:tc>
           <w:tcPr>
-            <w:tcW w:type="dxa" w:w="1728"/>
+            <w:tcW w:type="dxa" w:w="2016"/>
             <w:tcMar>
-              <w:top w:w="100" w:type="dxa"/>
-              <w:bottom w:w="100" w:type="dxa"/>
-              <w:left w:w="120" w:type="dxa"/>
-              <w:right w:w="120" w:type="dxa"/>
+              <w:top w:w="90" w:type="dxa"/>
+              <w:bottom w:w="90" w:type="dxa"/>
+              <w:left w:w="100" w:type="dxa"/>
+              <w:right w:w="100" w:type="dxa"/>
             </w:tcMar>
             <w:shd w:fill="F7FAFC"/>
           </w:tcPr>
@@ -1305,9 +1305,9 @@
               <w:rPr>
                 <w:rFonts w:ascii="Calibri" w:hAnsi="Calibri"/>
                 <w:color w:val="2D3748"/>
-                <w:sz w:val="17"/>
+                <w:sz w:val="16"/>
               </w:rPr>
-              <w:t>Azure PostgreSQL Flexible</w:t>
+              <w:t>VPS PostgreSQL veya Azure Flexible Server</w:t>
             </w:r>
           </w:p>
         </w:tc>
@@ -1317,10 +1317,10 @@
           <w:tcPr>
             <w:tcW w:type="dxa" w:w="1728"/>
             <w:tcMar>
-              <w:top w:w="100" w:type="dxa"/>
-              <w:bottom w:w="100" w:type="dxa"/>
-              <w:left w:w="120" w:type="dxa"/>
-              <w:right w:w="120" w:type="dxa"/>
+              <w:top w:w="90" w:type="dxa"/>
+              <w:bottom w:w="90" w:type="dxa"/>
+              <w:left w:w="100" w:type="dxa"/>
+              <w:right w:w="100" w:type="dxa"/>
             </w:tcMar>
             <w:shd w:fill="FFFFFF"/>
           </w:tcPr>
@@ -1332,7 +1332,7 @@
               <w:rPr>
                 <w:rFonts w:ascii="Calibri" w:hAnsi="Calibri"/>
                 <w:color w:val="2D3748"/>
-                <w:sz w:val="17"/>
+                <w:sz w:val="16"/>
               </w:rPr>
               <w:t>8. Konteyner &amp; DevOps</w:t>
             </w:r>
@@ -1340,12 +1340,12 @@
         </w:tc>
         <w:tc>
           <w:tcPr>
-            <w:tcW w:type="dxa" w:w="2160"/>
+            <w:tcW w:type="dxa" w:w="2016"/>
             <w:tcMar>
-              <w:top w:w="100" w:type="dxa"/>
-              <w:bottom w:w="100" w:type="dxa"/>
-              <w:left w:w="120" w:type="dxa"/>
-              <w:right w:w="120" w:type="dxa"/>
+              <w:top w:w="90" w:type="dxa"/>
+              <w:bottom w:w="90" w:type="dxa"/>
+              <w:left w:w="100" w:type="dxa"/>
+              <w:right w:w="100" w:type="dxa"/>
             </w:tcMar>
             <w:shd w:fill="FFFFFF"/>
           </w:tcPr>
@@ -1357,9 +1357,9 @@
               <w:rPr>
                 <w:rFonts w:ascii="Calibri" w:hAnsi="Calibri"/>
                 <w:color w:val="2D3748"/>
-                <w:sz w:val="17"/>
+                <w:sz w:val="16"/>
               </w:rPr>
-              <w:t>İzole, hafif ve taşınabilir multi-stage konteyner altyapısı.</w:t>
+              <w:t>Çok aşamalı imaj ve tam yığın docker-compose orkestrasyonu.</w:t>
             </w:r>
           </w:p>
         </w:tc>
@@ -1367,10 +1367,10 @@
           <w:tcPr>
             <w:tcW w:type="dxa" w:w="1584"/>
             <w:tcMar>
-              <w:top w:w="100" w:type="dxa"/>
-              <w:bottom w:w="100" w:type="dxa"/>
-              <w:left w:w="120" w:type="dxa"/>
-              <w:right w:w="120" w:type="dxa"/>
+              <w:top w:w="90" w:type="dxa"/>
+              <w:bottom w:w="90" w:type="dxa"/>
+              <w:left w:w="100" w:type="dxa"/>
+              <w:right w:w="100" w:type="dxa"/>
             </w:tcMar>
             <w:shd w:fill="FFFFFF"/>
           </w:tcPr>
@@ -1382,9 +1382,9 @@
               <w:rPr>
                 <w:rFonts w:ascii="Calibri" w:hAnsi="Calibri"/>
                 <w:color w:val="2D3748"/>
-                <w:sz w:val="17"/>
+                <w:sz w:val="16"/>
               </w:rPr>
-              <w:t>Dockerfile</w:t>
+              <w:t>Dockerfile &amp; Compose</w:t>
             </w:r>
           </w:p>
         </w:tc>
@@ -1392,10 +1392,10 @@
           <w:tcPr>
             <w:tcW w:type="dxa" w:w="1728"/>
             <w:tcMar>
-              <w:top w:w="100" w:type="dxa"/>
-              <w:bottom w:w="100" w:type="dxa"/>
-              <w:left w:w="120" w:type="dxa"/>
-              <w:right w:w="120" w:type="dxa"/>
+              <w:top w:w="90" w:type="dxa"/>
+              <w:bottom w:w="90" w:type="dxa"/>
+              <w:left w:w="100" w:type="dxa"/>
+              <w:right w:w="100" w:type="dxa"/>
             </w:tcMar>
             <w:shd w:fill="FFFFFF"/>
           </w:tcPr>
@@ -1407,20 +1407,20 @@
               <w:rPr>
                 <w:rFonts w:ascii="Calibri" w:hAnsi="Calibri"/>
                 <w:color w:val="2D3748"/>
-                <w:sz w:val="17"/>
+                <w:sz w:val="16"/>
               </w:rPr>
-              <w:t>Docker (Temurin 21 JRE Alpine)</w:t>
+              <w:t>Docker, Docker Compose, Alpine JRE 21</w:t>
             </w:r>
           </w:p>
         </w:tc>
         <w:tc>
           <w:tcPr>
-            <w:tcW w:type="dxa" w:w="1440"/>
+            <w:tcW w:type="dxa" w:w="1728"/>
             <w:tcMar>
-              <w:top w:w="100" w:type="dxa"/>
-              <w:bottom w:w="100" w:type="dxa"/>
-              <w:left w:w="120" w:type="dxa"/>
-              <w:right w:w="120" w:type="dxa"/>
+              <w:top w:w="90" w:type="dxa"/>
+              <w:bottom w:w="90" w:type="dxa"/>
+              <w:left w:w="100" w:type="dxa"/>
+              <w:right w:w="100" w:type="dxa"/>
             </w:tcMar>
             <w:shd w:fill="FFFFFF"/>
           </w:tcPr>
@@ -1432,20 +1432,20 @@
               <w:rPr>
                 <w:rFonts w:ascii="Calibri" w:hAnsi="Calibri"/>
                 <w:color w:val="2D3748"/>
-                <w:sz w:val="17"/>
+                <w:sz w:val="16"/>
               </w:rPr>
-              <w:t>Render Docker</w:t>
+              <w:t>Render / VPS docker-compose</w:t>
             </w:r>
           </w:p>
         </w:tc>
         <w:tc>
           <w:tcPr>
-            <w:tcW w:type="dxa" w:w="1728"/>
+            <w:tcW w:type="dxa" w:w="2016"/>
             <w:tcMar>
-              <w:top w:w="100" w:type="dxa"/>
-              <w:bottom w:w="100" w:type="dxa"/>
-              <w:left w:w="120" w:type="dxa"/>
-              <w:right w:w="120" w:type="dxa"/>
+              <w:top w:w="90" w:type="dxa"/>
+              <w:bottom w:w="90" w:type="dxa"/>
+              <w:left w:w="100" w:type="dxa"/>
+              <w:right w:w="100" w:type="dxa"/>
             </w:tcMar>
             <w:shd w:fill="FFFFFF"/>
           </w:tcPr>
@@ -1457,9 +1457,9 @@
               <w:rPr>
                 <w:rFonts w:ascii="Calibri" w:hAnsi="Calibri"/>
                 <w:color w:val="2D3748"/>
-                <w:sz w:val="17"/>
+                <w:sz w:val="16"/>
               </w:rPr>
-              <w:t>Azure ACR + Container Apps</w:t>
+              <w:t>Dedicated VPS veya Azure ACR + ACA</w:t>
             </w:r>
           </w:p>
         </w:tc>
@@ -1469,10 +1469,10 @@
           <w:tcPr>
             <w:tcW w:type="dxa" w:w="1728"/>
             <w:tcMar>
-              <w:top w:w="100" w:type="dxa"/>
-              <w:bottom w:w="100" w:type="dxa"/>
-              <w:left w:w="120" w:type="dxa"/>
-              <w:right w:w="120" w:type="dxa"/>
+              <w:top w:w="90" w:type="dxa"/>
+              <w:bottom w:w="90" w:type="dxa"/>
+              <w:left w:w="100" w:type="dxa"/>
+              <w:right w:w="100" w:type="dxa"/>
             </w:tcMar>
             <w:shd w:fill="F7FAFC"/>
           </w:tcPr>
@@ -1484,20 +1484,20 @@
               <w:rPr>
                 <w:rFonts w:ascii="Calibri" w:hAnsi="Calibri"/>
                 <w:color w:val="2D3748"/>
-                <w:sz w:val="17"/>
+                <w:sz w:val="16"/>
               </w:rPr>
-              <w:t>9. Sağlık &amp; Keep-Alive</w:t>
+              <w:t>9. Sağlık &amp; İzleme</w:t>
             </w:r>
           </w:p>
         </w:tc>
         <w:tc>
           <w:tcPr>
-            <w:tcW w:type="dxa" w:w="2160"/>
+            <w:tcW w:type="dxa" w:w="2016"/>
             <w:tcMar>
-              <w:top w:w="100" w:type="dxa"/>
-              <w:bottom w:w="100" w:type="dxa"/>
-              <w:left w:w="120" w:type="dxa"/>
-              <w:right w:w="120" w:type="dxa"/>
+              <w:top w:w="90" w:type="dxa"/>
+              <w:bottom w:w="90" w:type="dxa"/>
+              <w:left w:w="100" w:type="dxa"/>
+              <w:right w:w="100" w:type="dxa"/>
             </w:tcMar>
             <w:shd w:fill="F7FAFC"/>
           </w:tcPr>
@@ -1509,9 +1509,9 @@
               <w:rPr>
                 <w:rFonts w:ascii="Calibri" w:hAnsi="Calibri"/>
                 <w:color w:val="2D3748"/>
-                <w:sz w:val="17"/>
+                <w:sz w:val="16"/>
               </w:rPr>
-              <w:t>Ücretsiz sunucu soğuk başlangıcını (cold start) engelleme, sağlık kontrolü.</w:t>
+              <w:t>Sunucu soğuk başlangıç ve çalışma durumu denetimi.</w:t>
             </w:r>
           </w:p>
         </w:tc>
@@ -1519,10 +1519,10 @@
           <w:tcPr>
             <w:tcW w:type="dxa" w:w="1584"/>
             <w:tcMar>
-              <w:top w:w="100" w:type="dxa"/>
-              <w:bottom w:w="100" w:type="dxa"/>
-              <w:left w:w="120" w:type="dxa"/>
-              <w:right w:w="120" w:type="dxa"/>
+              <w:top w:w="90" w:type="dxa"/>
+              <w:bottom w:w="90" w:type="dxa"/>
+              <w:left w:w="100" w:type="dxa"/>
+              <w:right w:w="100" w:type="dxa"/>
             </w:tcMar>
             <w:shd w:fill="F7FAFC"/>
           </w:tcPr>
@@ -1534,7 +1534,7 @@
               <w:rPr>
                 <w:rFonts w:ascii="Calibri" w:hAnsi="Calibri"/>
                 <w:color w:val="2D3748"/>
-                <w:sz w:val="17"/>
+                <w:sz w:val="16"/>
               </w:rPr>
               <w:t>HTTP / JSON</w:t>
             </w:r>
@@ -1544,10 +1544,10 @@
           <w:tcPr>
             <w:tcW w:type="dxa" w:w="1728"/>
             <w:tcMar>
-              <w:top w:w="100" w:type="dxa"/>
-              <w:bottom w:w="100" w:type="dxa"/>
-              <w:left w:w="120" w:type="dxa"/>
-              <w:right w:w="120" w:type="dxa"/>
+              <w:top w:w="90" w:type="dxa"/>
+              <w:bottom w:w="90" w:type="dxa"/>
+              <w:left w:w="100" w:type="dxa"/>
+              <w:right w:w="100" w:type="dxa"/>
             </w:tcMar>
             <w:shd w:fill="F7FAFC"/>
           </w:tcPr>
@@ -1559,7 +1559,7 @@
               <w:rPr>
                 <w:rFonts w:ascii="Calibri" w:hAnsi="Calibri"/>
                 <w:color w:val="2D3748"/>
-                <w:sz w:val="17"/>
+                <w:sz w:val="16"/>
               </w:rPr>
               <w:t>Spring Boot Actuator</w:t>
             </w:r>
@@ -1567,12 +1567,12 @@
         </w:tc>
         <w:tc>
           <w:tcPr>
-            <w:tcW w:type="dxa" w:w="1440"/>
+            <w:tcW w:type="dxa" w:w="1728"/>
             <w:tcMar>
-              <w:top w:w="100" w:type="dxa"/>
-              <w:bottom w:w="100" w:type="dxa"/>
-              <w:left w:w="120" w:type="dxa"/>
-              <w:right w:w="120" w:type="dxa"/>
+              <w:top w:w="90" w:type="dxa"/>
+              <w:bottom w:w="90" w:type="dxa"/>
+              <w:left w:w="100" w:type="dxa"/>
+              <w:right w:w="100" w:type="dxa"/>
             </w:tcMar>
             <w:shd w:fill="F7FAFC"/>
           </w:tcPr>
@@ -1584,20 +1584,20 @@
               <w:rPr>
                 <w:rFonts w:ascii="Calibri" w:hAnsi="Calibri"/>
                 <w:color w:val="2D3748"/>
-                <w:sz w:val="17"/>
+                <w:sz w:val="16"/>
               </w:rPr>
-              <w:t>UptimeRobot (Ping)</w:t>
+              <w:t>UptimeRobot / VPS Systemd</w:t>
             </w:r>
           </w:p>
         </w:tc>
         <w:tc>
           <w:tcPr>
-            <w:tcW w:type="dxa" w:w="1728"/>
+            <w:tcW w:type="dxa" w:w="2016"/>
             <w:tcMar>
-              <w:top w:w="100" w:type="dxa"/>
-              <w:bottom w:w="100" w:type="dxa"/>
-              <w:left w:w="120" w:type="dxa"/>
-              <w:right w:w="120" w:type="dxa"/>
+              <w:top w:w="90" w:type="dxa"/>
+              <w:bottom w:w="90" w:type="dxa"/>
+              <w:left w:w="100" w:type="dxa"/>
+              <w:right w:w="100" w:type="dxa"/>
             </w:tcMar>
             <w:shd w:fill="F7FAFC"/>
           </w:tcPr>
@@ -1609,9 +1609,9 @@
               <w:rPr>
                 <w:rFonts w:ascii="Calibri" w:hAnsi="Calibri"/>
                 <w:color w:val="2D3748"/>
-                <w:sz w:val="17"/>
+                <w:sz w:val="16"/>
               </w:rPr>
-              <w:t>Azure App Insights</w:t>
+              <w:t>VPS Uptime / Azure App Insights</w:t>
             </w:r>
           </w:p>
         </w:tc>
@@ -1629,7 +1629,152 @@
           <w:color w:val="1A365D"/>
           <w:sz w:val="28"/>
         </w:rPr>
-        <w:t>2. Detaylı Katman Tasarımı ve Sorumluluk Dağılımı</w:t>
+        <w:t>2. Üç Aşamalı Dağıtım ve Hibrit Satış Stratejisi</w:t>
+      </w:r>
+    </w:p>
+    <w:p>
+      <w:pPr>
+        <w:keepNext/>
+        <w:spacing w:before="240" w:after="80"/>
+      </w:pPr>
+      <w:r>
+        <w:rPr>
+          <w:rFonts w:ascii="Calibri" w:hAnsi="Calibri"/>
+          <w:b/>
+          <w:color w:val="3182CE"/>
+          <w:sz w:val="24"/>
+        </w:rPr>
+        <w:t>Aşama 1: Sıfır Maliyetli Geliştirme &amp; İlk Testler ($0 / Ay)</w:t>
+      </w:r>
+    </w:p>
+    <w:p>
+      <w:pPr>
+        <w:spacing w:before="40" w:after="80" w:line="276" w:lineRule="auto"/>
+      </w:pPr>
+      <w:r>
+        <w:rPr>
+          <w:rFonts w:ascii="Calibri" w:hAnsi="Calibri"/>
+          <w:color w:val="2D3748"/>
+          <w:sz w:val="21"/>
+        </w:rPr>
+        <w:t>Geliştirme ve ilk doğrulama sürecinde ekibin ve şirketin cebinden tek kuruş harcanmaz. Backend Render üzerinde, frontend Vercel Edge ağında ve veritabanı Supabase Free Tier üzerinde çalışır. UptimeRobot ile sistem uyanık tutulur.</w:t>
+      </w:r>
+    </w:p>
+    <w:p>
+      <w:pPr>
+        <w:keepNext/>
+        <w:spacing w:before="240" w:after="80"/>
+      </w:pPr>
+      <w:r>
+        <w:rPr>
+          <w:rFonts w:ascii="Calibri" w:hAnsi="Calibri"/>
+          <w:b/>
+          <w:color w:val="3182CE"/>
+          <w:sz w:val="24"/>
+        </w:rPr>
+        <w:t>Aşama 2: Canlı Demo ve İlk Ay Yayını (Yüksek Performanslı Ucuz VPS - ~150-250 TL / Ay)</w:t>
+      </w:r>
+    </w:p>
+    <w:p>
+      <w:pPr>
+        <w:spacing w:before="40" w:after="80" w:line="276" w:lineRule="auto"/>
+      </w:pPr>
+      <w:r>
+        <w:rPr>
+          <w:rFonts w:ascii="Calibri" w:hAnsi="Calibri"/>
+          <w:color w:val="2D3748"/>
+          <w:sz w:val="21"/>
+        </w:rPr>
+        <w:t>Müşteriye sunum yapılacak ve canlı testlerin yürütüleceği ilk ay, Hetzner Cloud (CX22 paketi ~4€) veya DigitalOcean üzerinde 2 vCPU, 4 GB RAM'li bir Linux VPS açılır. Docker Compose ile Backend, Frontend, PostgreSQL ve Nginx tek komutla (docker compose up -d) kurulur. Bu sayede hiçbir soğuk başlangıç (cold start) gecikmesi yaşanmaz; sistem müşteriye anında, akıcı ve yüksek hızda gösterilir.</w:t>
+      </w:r>
+    </w:p>
+    <w:p>
+      <w:pPr>
+        <w:keepNext/>
+        <w:spacing w:before="240" w:after="80"/>
+      </w:pPr>
+      <w:r>
+        <w:rPr>
+          <w:rFonts w:ascii="Calibri" w:hAnsi="Calibri"/>
+          <w:b/>
+          <w:color w:val="3182CE"/>
+          <w:sz w:val="24"/>
+        </w:rPr>
+        <w:t>Aşama 3: Müşteri Tercihine Göre Çift Paket Satış Modeli</w:t>
+      </w:r>
+    </w:p>
+    <w:p>
+      <w:pPr>
+        <w:spacing w:before="40" w:after="80" w:line="276" w:lineRule="auto"/>
+      </w:pPr>
+      <w:r>
+        <w:rPr>
+          <w:rFonts w:ascii="Calibri" w:hAnsi="Calibri"/>
+          <w:color w:val="2D3748"/>
+          <w:sz w:val="21"/>
+        </w:rPr>
+        <w:t>Ürün müşteriyle el sıkışıldığında distribütörün bütçesine, ölçeğine ve kurumsal gereksinimlerine göre iki alternatif sunulur:</w:t>
+      </w:r>
+    </w:p>
+    <w:p>
+      <w:pPr>
+        <w:pStyle w:val="ListBullet"/>
+        <w:spacing w:before="20" w:after="60" w:line="276" w:lineRule="auto"/>
+      </w:pPr>
+      <w:r>
+        <w:rPr>
+          <w:rFonts w:ascii="Calibri" w:hAnsi="Calibri"/>
+          <w:b/>
+          <w:color w:val="2D3748"/>
+          <w:sz w:val="21"/>
+        </w:rPr>
+        <w:t xml:space="preserve">A) Ekonomik KOBİ Paketi (Dedicated VPS): </w:t>
+      </w:r>
+      <w:r>
+        <w:rPr>
+          <w:rFonts w:ascii="Calibri" w:hAnsi="Calibri"/>
+          <w:color w:val="2D3748"/>
+          <w:sz w:val="21"/>
+        </w:rPr>
+        <w:t>Aylık işletme giderini minimumda tutmak isteyen (aylık 250-500 TL civarı) müşterilere dedicated VPS sunulur. Otomatik yedekleme cronjob'ları ile güvenliği sağlanır.</w:t>
+      </w:r>
+    </w:p>
+    <w:p>
+      <w:pPr>
+        <w:pStyle w:val="ListBullet"/>
+        <w:spacing w:before="20" w:after="60" w:line="276" w:lineRule="auto"/>
+      </w:pPr>
+      <w:r>
+        <w:rPr>
+          <w:rFonts w:ascii="Calibri" w:hAnsi="Calibri"/>
+          <w:b/>
+          <w:color w:val="2D3748"/>
+          <w:sz w:val="21"/>
+        </w:rPr>
+        <w:t xml:space="preserve">B) Enterprise Kurumsal Paket (Microsoft Azure): </w:t>
+      </w:r>
+      <w:r>
+        <w:rPr>
+          <w:rFonts w:ascii="Calibri" w:hAnsi="Calibri"/>
+          <w:color w:val="2D3748"/>
+          <w:sz w:val="21"/>
+        </w:rPr>
+        <w:t>Banka seviyesinde regülasyon uyumu, resmi SLA garantisi, coğrafi yedeklilik ve yüksek ölçeklenebilirlik talep eden kurumsal distribütörlere Azure Database for PostgreSQL (Flexible Server) + Azure Container Apps altyapısı sunulur.</w:t>
+      </w:r>
+    </w:p>
+    <w:p>
+      <w:pPr>
+        <w:keepNext/>
+        <w:spacing w:before="360" w:after="120"/>
+      </w:pPr>
+      <w:r>
+        <w:rPr>
+          <w:rFonts w:ascii="Calibri" w:hAnsi="Calibri"/>
+          <w:b/>
+          <w:color w:val="1A365D"/>
+          <w:sz w:val="28"/>
+        </w:rPr>
+        <w:t>3. Detaylı Katman Tasarımı ve Sorumluluk Dağılımı</w:t>
       </w:r>
     </w:p>
     <w:p>
@@ -1667,7 +1812,7 @@
           <w:color w:val="2D3748"/>
           <w:sz w:val="21"/>
         </w:rPr>
-        <w:t>Temsilcinin arabada veya müşteri kapısında 17 kolonluk Excel formunu 3 tıkla doldurabileceği Hızlı Ziyaret Modu sunmak. Yöneticiler için filtrelenebilir Dashboard, Müşteri Portföyü ve Numune Takip Masası sağlamak. PWA (Progressive Web App) altyapısıyla masaüstü ve telefona tek tıkla uygulama olarak yüklenebilmek.</w:t>
+        <w:t>Temsilcinin arabada veya müşteri kapısında 17 kolonluk Excel formunu 3 tıkla doldurabileceği Hızlı Ziyaret Modu sunmak. Yöneticiler için filtrelenebilir Dashboard, Müşteri Portföyü ve Numune Takip Masası sağlamak. PWA altyapısıyla masaüstü ve telefona tek tıkla uygulama olarak yüklenebilmek.</w:t>
       </w:r>
     </w:p>
     <w:p>
@@ -1789,7 +1934,7 @@
           <w:color w:val="2D3748"/>
           <w:sz w:val="21"/>
         </w:rPr>
-        <w:t>Stateless JWT doğrulaması, BCrypt parola şifreleme, Rol Tabanlı Erişim (ROLE_ADMIN, ROLE_SALES_REP) ve veri izolasyonu. Bir temsilci başka bir temsilcinin müşterisini veya ziyaretini URL üzerinden dahi çekemez.</w:t>
+        <w:t>Stateless JWT doğrulaması, BCrypt parola şifreleme, Rol Tabanlı Erişim (ROLE_ADMIN, ROLE_SALES_REP) ve veri izolasyonu. Bir temsilci başka bir temsilcinin müşterisini veya ziyaretini çekemez.</w:t>
       </w:r>
     </w:p>
     <w:p>
@@ -1850,7 +1995,7 @@
           <w:color w:val="2D3748"/>
           <w:sz w:val="21"/>
         </w:rPr>
-        <w:t>Excel'deki 17 kolonu koordine eden iş kuralları: Müşteri-Yetkili ilişkisi, ziyaret kaydedilirken numune bırakıldıysa otomatik Numune Takip nesnesi oluşturulması, teklife dönüşüm takibi ve sonraki randevu ajandası. Tüm kritik süreçler @Transactional ile ACID garantilidir.</w:t>
+        <w:t>Excel'deki 17 kolonu koordine eden iş kuralları: Müşteri-Yetkili ilişkisi, ziyaret kaydedilirken numune bırakıldıysa otomatik Numune Takip nesnesi oluşturulması, teklife dönüşüm takibi ve sonraki randevu ajandası (@Transactional).</w:t>
       </w:r>
     </w:p>
     <w:p>
@@ -1911,7 +2056,7 @@
           <w:color w:val="2D3748"/>
           <w:sz w:val="21"/>
         </w:rPr>
-        <w:t>Excel Import (sahadaki mevcut 17 kolonluk Excel'i yükleyerek müşteri ve geçmiş verileri veritabanına aktarma) ve Excel Export (istenilen tarih ve temsilci filtresine göre anlık 17 kolonluk şablon formatında .xlsx üretme).</w:t>
+        <w:t>Excel Import (mevcut 17 kolonluk Excel dosyasını yükleyip sisteme aktarma) ve Excel Export (seçilen tarih/temsilci filtresine göre 17 kolonluk orijinal şablonla anlık .xlsx raporu üretme).</w:t>
       </w:r>
     </w:p>
     <w:p>
@@ -1934,7 +2079,7 @@
           <w:color w:val="2D3748"/>
           <w:sz w:val="21"/>
         </w:rPr>
-        <w:t>Apache POI (poi-ooxml), SXSSFWorkbook (düşük bellek tüketimli streaming yazıcı).</w:t>
+        <w:t>Apache POI (poi-ooxml), SXSSFWorkbook (streaming bellek mimarisi).</w:t>
       </w:r>
     </w:p>
     <w:p>
@@ -1995,7 +2140,7 @@
           <w:color w:val="2D3748"/>
           <w:sz w:val="21"/>
         </w:rPr>
-        <w:t>Spring Data JPA, Hibernate ORM, HikariCP (Bağlantı havuzu boyutu: 5-10).</w:t>
+        <w:t>Spring Data JPA, Hibernate ORM, HikariCP.</w:t>
       </w:r>
     </w:p>
     <w:p>
@@ -2033,7 +2178,7 @@
           <w:color w:val="2D3748"/>
           <w:sz w:val="21"/>
         </w:rPr>
-        <w:t>ACID uyumlu ilişkisel veri depolama. Tablolar kesinlikle arayüzden elle açılmaz; Flyway SQL scriptleri (V1__init_schema.sql) ile kod tabanında tutulur. Azure DB açıldığında şema saniyeler içinde otomatik ayağa kalkar.</w:t>
+        <w:t>ACID uyumlu ilişkisel veri depolama. Tablolar kesinlikle arayüzden elle açılmaz; Flyway SQL scriptleri (V1__init_schema.sql) ile kod tabanında tutulur. Hem VPS'te hem Azure'da saniyeler içinde otomatik ayağa kalkar.</w:t>
       </w:r>
     </w:p>
     <w:p>
@@ -2056,7 +2201,7 @@
           <w:color w:val="2D3748"/>
           <w:sz w:val="21"/>
         </w:rPr>
-        <w:t>PostgreSQL 15+, Flyway Migration. (PoC: Supabase Free Tier | Prod: Azure PostgreSQL Flexible).</w:t>
+        <w:t>PostgreSQL 15+, Flyway Migration.</w:t>
       </w:r>
     </w:p>
     <w:p>
@@ -2094,7 +2239,7 @@
           <w:color w:val="2D3748"/>
           <w:sz w:val="21"/>
         </w:rPr>
-        <w:t>12-Factor App uyumluluğu (sıfır hardcoded şifre/URL, sadece Environment Variables). Multi-stage Dockerfile ile ~180 MB optimize imaj üretimi. Yerel ortamda, Render'da ve Azure Container Apps'te birebir aynı çalışma garantisi.</w:t>
+        <w:t>12-Factor App uyumluluğu. Multi-stage Dockerfile (minimal JRE imajı) ve docker-compose.yml (tam yığın orkestrasyonu). Kodda 1 satır değiştirmeden yerelde, VPS'te veya Azure'da çalışma garantisi.</w:t>
       </w:r>
     </w:p>
     <w:p>
@@ -2117,7 +2262,7 @@
           <w:color w:val="2D3748"/>
           <w:sz w:val="21"/>
         </w:rPr>
-        <w:t>Docker, Render.com (Backend), Vercel (Frontend), Azure Container Apps (Gelecek hedef).</w:t>
+        <w:t>Docker, Docker Compose, Nginx, Azure Container Apps.</w:t>
       </w:r>
     </w:p>
     <w:p>
@@ -2132,7 +2277,7 @@
           <w:color w:val="3182CE"/>
           <w:sz w:val="24"/>
         </w:rPr>
-        <w:t>Katman 9: Gözlemlenebilirlik ve Keep-Alive Katmanı (Health &amp; Uptime)</w:t>
+        <w:t>Katman 9: Gözlemlenebilirlik ve İzleme Katmanı (Health &amp; Observability)</w:t>
       </w:r>
     </w:p>
     <w:p>
@@ -2155,7 +2300,7 @@
           <w:color w:val="2D3748"/>
           <w:sz w:val="21"/>
         </w:rPr>
-        <w:t>Render ücretsiz katmanında 15 dakika hareketsizlik sonrası oluşan uyku modunu (spin-down / 50 saniyelik cold start) UptimeRobot ile 5 dakikada bir /actuator/health uç noktasına GET isteği atarak sıfırlamak; sistemi 7/24 sıcak ve anında açılır tutmak.</w:t>
+        <w:t>Spring Boot Actuator ile /actuator/health uç noktası üzerinden sağlık ve metrik takibi. VPS ortamında systemd/docker izleme; Azure'da Application Insights.</w:t>
       </w:r>
     </w:p>
     <w:p>
@@ -2178,7 +2323,7 @@
           <w:color w:val="2D3748"/>
           <w:sz w:val="21"/>
         </w:rPr>
-        <w:t>Spring Boot Actuator, UptimeRobot.</w:t>
+        <w:t>Spring Boot Actuator, UptimeRobot, Azure Monitor.</w:t>
       </w:r>
     </w:p>
     <w:p>
@@ -2193,7 +2338,7 @@
           <w:color w:val="1A365D"/>
           <w:sz w:val="28"/>
         </w:rPr>
-        <w:t>3. Katmanlar Arası Uçtan Uca Veri Akışı (Saha Ziyareti Senaryosu)</w:t>
+        <w:t>4. Ortamlar Arası Sıfır Kod Değişikliği (Environment Variables Matrisi)</w:t>
       </w:r>
     </w:p>
     <w:p>
@@ -2206,196 +2351,7 @@
           <w:color w:val="2D3748"/>
           <w:sz w:val="21"/>
         </w:rPr>
-        <w:t>Saha temsilcisi bir müşteriye gidip numune bıraktığında verinin katmanlar arasındaki akışı şu şekildedir:</w:t>
-      </w:r>
-    </w:p>
-    <w:p>
-      <w:pPr>
-        <w:pStyle w:val="ListBullet"/>
-        <w:spacing w:before="20" w:after="60" w:line="276" w:lineRule="auto"/>
-      </w:pPr>
-      <w:r>
-        <w:rPr>
-          <w:rFonts w:ascii="Calibri" w:hAnsi="Calibri"/>
-          <w:b/>
-          <w:color w:val="2D3748"/>
-          <w:sz w:val="21"/>
-        </w:rPr>
-        <w:t xml:space="preserve">1. Adım (Sunum): </w:t>
-      </w:r>
-      <w:r>
-        <w:rPr>
-          <w:rFonts w:ascii="Calibri" w:hAnsi="Calibri"/>
-          <w:color w:val="2D3748"/>
-          <w:sz w:val="21"/>
-        </w:rPr>
-        <w:t>Temsilci mobil ekranda müşteriyi seçer, 'Numune Verildi' switch'ini açar, ürün ve adedi seçip kaydeder.</w:t>
-      </w:r>
-    </w:p>
-    <w:p>
-      <w:pPr>
-        <w:pStyle w:val="ListBullet"/>
-        <w:spacing w:before="20" w:after="60" w:line="276" w:lineRule="auto"/>
-      </w:pPr>
-      <w:r>
-        <w:rPr>
-          <w:rFonts w:ascii="Calibri" w:hAnsi="Calibri"/>
-          <w:b/>
-          <w:color w:val="2D3748"/>
-          <w:sz w:val="21"/>
-        </w:rPr>
-        <w:t xml:space="preserve">2. Adım (Ağ &amp; Güvenlik): </w:t>
-      </w:r>
-      <w:r>
-        <w:rPr>
-          <w:rFonts w:ascii="Calibri" w:hAnsi="Calibri"/>
-          <w:color w:val="2D3748"/>
-          <w:sz w:val="21"/>
-        </w:rPr>
-        <w:t>React SPA, Axios ile Authorization: Bearer &lt;JWT&gt; başlığı ekleyerek POST /api/v1/visits isteği gönderir.</w:t>
-      </w:r>
-    </w:p>
-    <w:p>
-      <w:pPr>
-        <w:pStyle w:val="ListBullet"/>
-        <w:spacing w:before="20" w:after="60" w:line="276" w:lineRule="auto"/>
-      </w:pPr>
-      <w:r>
-        <w:rPr>
-          <w:rFonts w:ascii="Calibri" w:hAnsi="Calibri"/>
-          <w:b/>
-          <w:color w:val="2D3748"/>
-          <w:sz w:val="21"/>
-        </w:rPr>
-        <w:t xml:space="preserve">3. Adım (Yetkilendirme): </w:t>
-      </w:r>
-      <w:r>
-        <w:rPr>
-          <w:rFonts w:ascii="Calibri" w:hAnsi="Calibri"/>
-          <w:color w:val="2D3748"/>
-          <w:sz w:val="21"/>
-        </w:rPr>
-        <w:t>Spring Security isteği yakalar, JWT imzasını doğrular, temsilcinin kimliğini ve SALES_REP rolünü Context'e yerleştirir.</w:t>
-      </w:r>
-    </w:p>
-    <w:p>
-      <w:pPr>
-        <w:pStyle w:val="ListBullet"/>
-        <w:spacing w:before="20" w:after="60" w:line="276" w:lineRule="auto"/>
-      </w:pPr>
-      <w:r>
-        <w:rPr>
-          <w:rFonts w:ascii="Calibri" w:hAnsi="Calibri"/>
-          <w:b/>
-          <w:color w:val="2D3748"/>
-          <w:sz w:val="21"/>
-        </w:rPr>
-        <w:t xml:space="preserve">4. Adım (API &amp; Validasyon): </w:t>
-      </w:r>
-      <w:r>
-        <w:rPr>
-          <w:rFonts w:ascii="Calibri" w:hAnsi="Calibri"/>
-          <w:color w:val="2D3748"/>
-          <w:sz w:val="21"/>
-        </w:rPr>
-        <w:t>VisitController @Valid anotasyonu ile gelen DTO'nun zorunlu alanlarını doğrular.</w:t>
-      </w:r>
-    </w:p>
-    <w:p>
-      <w:pPr>
-        <w:pStyle w:val="ListBullet"/>
-        <w:spacing w:before="20" w:after="60" w:line="276" w:lineRule="auto"/>
-      </w:pPr>
-      <w:r>
-        <w:rPr>
-          <w:rFonts w:ascii="Calibri" w:hAnsi="Calibri"/>
-          <w:b/>
-          <w:color w:val="2D3748"/>
-          <w:sz w:val="21"/>
-        </w:rPr>
-        <w:t xml:space="preserve">5. Adım (İş Mantığı): </w:t>
-      </w:r>
-      <w:r>
-        <w:rPr>
-          <w:rFonts w:ascii="Calibri" w:hAnsi="Calibri"/>
-          <w:color w:val="2D3748"/>
-          <w:sz w:val="21"/>
-        </w:rPr>
-        <w:t>VisitService temsilcinin bu firmaya yetkili olduğunu doğrular. Ziyaret kaydını ve bağlı Numune kaydını 'BEKLEMEDE' statüsüyle tek bir işlemde hazırlar.</w:t>
-      </w:r>
-    </w:p>
-    <w:p>
-      <w:pPr>
-        <w:pStyle w:val="ListBullet"/>
-        <w:spacing w:before="20" w:after="60" w:line="276" w:lineRule="auto"/>
-      </w:pPr>
-      <w:r>
-        <w:rPr>
-          <w:rFonts w:ascii="Calibri" w:hAnsi="Calibri"/>
-          <w:b/>
-          <w:color w:val="2D3748"/>
-          <w:sz w:val="21"/>
-        </w:rPr>
-        <w:t xml:space="preserve">6. Adım (Veri Erişimi): </w:t>
-      </w:r>
-      <w:r>
-        <w:rPr>
-          <w:rFonts w:ascii="Calibri" w:hAnsi="Calibri"/>
-          <w:color w:val="2D3748"/>
-          <w:sz w:val="21"/>
-        </w:rPr>
-        <w:t>JPA Repository parametrik SQL sorgularını Hibernate üzerinden veritabanına iletir.</w:t>
-      </w:r>
-    </w:p>
-    <w:p>
-      <w:pPr>
-        <w:pStyle w:val="ListBullet"/>
-        <w:spacing w:before="20" w:after="60" w:line="276" w:lineRule="auto"/>
-      </w:pPr>
-      <w:r>
-        <w:rPr>
-          <w:rFonts w:ascii="Calibri" w:hAnsi="Calibri"/>
-          <w:b/>
-          <w:color w:val="2D3748"/>
-          <w:sz w:val="21"/>
-        </w:rPr>
-        <w:t xml:space="preserve">7. Adım (Kalıcılık): </w:t>
-      </w:r>
-      <w:r>
-        <w:rPr>
-          <w:rFonts w:ascii="Calibri" w:hAnsi="Calibri"/>
-          <w:color w:val="2D3748"/>
-          <w:sz w:val="21"/>
-        </w:rPr>
-        <w:t>PostgreSQL işlemi tamamlar. Dönen kimliklerle VisitResponseDTO oluşturulur ve istemciye HTTP 201 Created döner.</w:t>
-      </w:r>
-    </w:p>
-    <w:p>
-      <w:pPr>
-        <w:keepNext/>
-        <w:spacing w:before="360" w:after="120"/>
-      </w:pPr>
-      <w:r>
-        <w:rPr>
-          <w:rFonts w:ascii="Calibri" w:hAnsi="Calibri"/>
-          <w:b/>
-          <w:color w:val="1A365D"/>
-          <w:sz w:val="28"/>
-        </w:rPr>
-        <w:t>4. PoC'den Azure Kurumsal Ortamına Geçiş Mimarisi</w:t>
-      </w:r>
-    </w:p>
-    <w:p>
-      <w:pPr>
-        <w:spacing w:before="40" w:after="80" w:line="276" w:lineRule="auto"/>
-      </w:pPr>
-      <w:r>
-        <w:rPr>
-          <w:rFonts w:ascii="Calibri" w:hAnsi="Calibri"/>
-          <w:color w:val="2D3748"/>
-          <w:sz w:val="21"/>
-        </w:rPr>
-        <w:t>Geliştirilecek sistemin en büyük mühendislik gücü, ürün müşteriye sunulup satış kapandığında Azure ortamına taşınırken uygulama kodunda hiçbir değişiklik gerektirmemesidir. Yalnızca ortam değişkenleri (Environment Variables) güncellenecektir:</w:t>
+        <w:t>Uygulama kodunda hiçbir değişiklik yapılmadan, sadece ortam değişkenleri değiştirilerek geçiş sağlanır:</w:t>
       </w:r>
     </w:p>
     <w:tbl>
@@ -2406,19 +2362,20 @@
         <w:tblLook w:firstColumn="1" w:firstRow="1" w:lastColumn="0" w:lastRow="0" w:noHBand="0" w:noVBand="1" w:val="04A0"/>
       </w:tblPr>
       <w:tblGrid>
-        <w:gridCol w:w="3120"/>
-        <w:gridCol w:w="3120"/>
-        <w:gridCol w:w="3120"/>
+        <w:gridCol w:w="2340"/>
+        <w:gridCol w:w="2340"/>
+        <w:gridCol w:w="2340"/>
+        <w:gridCol w:w="2340"/>
       </w:tblGrid>
       <w:tr>
         <w:tc>
           <w:tcPr>
-            <w:tcW w:type="dxa" w:w="2880"/>
+            <w:tcW w:type="dxa" w:w="2160"/>
             <w:tcMar>
-              <w:top w:w="100" w:type="dxa"/>
-              <w:bottom w:w="100" w:type="dxa"/>
-              <w:left w:w="120" w:type="dxa"/>
-              <w:right w:w="120" w:type="dxa"/>
+              <w:top w:w="90" w:type="dxa"/>
+              <w:bottom w:w="90" w:type="dxa"/>
+              <w:left w:w="100" w:type="dxa"/>
+              <w:right w:w="100" w:type="dxa"/>
             </w:tcMar>
             <w:shd w:fill="1A365D"/>
           </w:tcPr>
@@ -2431,20 +2388,20 @@
                 <w:rFonts w:ascii="Calibri" w:hAnsi="Calibri"/>
                 <w:b/>
                 <w:color w:val="FFFFFF"/>
-                <w:sz w:val="19"/>
+                <w:sz w:val="18"/>
               </w:rPr>
-              <w:t>Konfigürasyon Parametresi</w:t>
+              <w:t>Ortam Değişkeni</w:t>
             </w:r>
           </w:p>
         </w:tc>
         <w:tc>
           <w:tcPr>
-            <w:tcW w:type="dxa" w:w="3888"/>
+            <w:tcW w:type="dxa" w:w="2880"/>
             <w:tcMar>
-              <w:top w:w="100" w:type="dxa"/>
-              <w:bottom w:w="100" w:type="dxa"/>
-              <w:left w:w="120" w:type="dxa"/>
-              <w:right w:w="120" w:type="dxa"/>
+              <w:top w:w="90" w:type="dxa"/>
+              <w:bottom w:w="90" w:type="dxa"/>
+              <w:left w:w="100" w:type="dxa"/>
+              <w:right w:w="100" w:type="dxa"/>
             </w:tcMar>
             <w:shd w:fill="1A365D"/>
           </w:tcPr>
@@ -2457,20 +2414,20 @@
                 <w:rFonts w:ascii="Calibri" w:hAnsi="Calibri"/>
                 <w:b/>
                 <w:color w:val="FFFFFF"/>
-                <w:sz w:val="19"/>
+                <w:sz w:val="18"/>
               </w:rPr>
-              <w:t>Sıfır Maliyetli PoC Değeri ($0)</w:t>
+              <w:t>PoC ($0 Ücretsiz)</w:t>
             </w:r>
           </w:p>
         </w:tc>
         <w:tc>
           <w:tcPr>
-            <w:tcW w:type="dxa" w:w="3888"/>
+            <w:tcW w:type="dxa" w:w="2880"/>
             <w:tcMar>
-              <w:top w:w="100" w:type="dxa"/>
-              <w:bottom w:w="100" w:type="dxa"/>
-              <w:left w:w="120" w:type="dxa"/>
-              <w:right w:w="120" w:type="dxa"/>
+              <w:top w:w="90" w:type="dxa"/>
+              <w:bottom w:w="90" w:type="dxa"/>
+              <w:left w:w="100" w:type="dxa"/>
+              <w:right w:w="100" w:type="dxa"/>
             </w:tcMar>
             <w:shd w:fill="1A365D"/>
           </w:tcPr>
@@ -2483,9 +2440,35 @@
                 <w:rFonts w:ascii="Calibri" w:hAnsi="Calibri"/>
                 <w:b/>
                 <w:color w:val="FFFFFF"/>
-                <w:sz w:val="19"/>
+                <w:sz w:val="18"/>
               </w:rPr>
-              <w:t>Azure Kurumsal Üretim Değeri (Enterprise)</w:t>
+              <w:t>Canlı Demo / KOBİ Satış (VPS)</w:t>
+            </w:r>
+          </w:p>
+        </w:tc>
+        <w:tc>
+          <w:tcPr>
+            <w:tcW w:type="dxa" w:w="3024"/>
+            <w:tcMar>
+              <w:top w:w="90" w:type="dxa"/>
+              <w:bottom w:w="90" w:type="dxa"/>
+              <w:left w:w="100" w:type="dxa"/>
+              <w:right w:w="100" w:type="dxa"/>
+            </w:tcMar>
+            <w:shd w:fill="1A365D"/>
+          </w:tcPr>
+          <w:p>
+            <w:pPr>
+              <w:spacing w:before="40" w:after="40"/>
+            </w:pPr>
+            <w:r>
+              <w:rPr>
+                <w:rFonts w:ascii="Calibri" w:hAnsi="Calibri"/>
+                <w:b/>
+                <w:color w:val="FFFFFF"/>
+                <w:sz w:val="18"/>
+              </w:rPr>
+              <w:t>Enterprise Satış (Azure)</w:t>
             </w:r>
           </w:p>
         </w:tc>
@@ -2493,12 +2476,12 @@
       <w:tr>
         <w:tc>
           <w:tcPr>
-            <w:tcW w:type="dxa" w:w="2880"/>
+            <w:tcW w:type="dxa" w:w="2160"/>
             <w:tcMar>
-              <w:top w:w="100" w:type="dxa"/>
-              <w:bottom w:w="100" w:type="dxa"/>
-              <w:left w:w="120" w:type="dxa"/>
-              <w:right w:w="120" w:type="dxa"/>
+              <w:top w:w="90" w:type="dxa"/>
+              <w:bottom w:w="90" w:type="dxa"/>
+              <w:left w:w="100" w:type="dxa"/>
+              <w:right w:w="100" w:type="dxa"/>
             </w:tcMar>
             <w:shd w:fill="F7FAFC"/>
           </w:tcPr>
@@ -2510,7 +2493,7 @@
               <w:rPr>
                 <w:rFonts w:ascii="Calibri" w:hAnsi="Calibri"/>
                 <w:color w:val="2D3748"/>
-                <w:sz w:val="17"/>
+                <w:sz w:val="16"/>
               </w:rPr>
               <w:t>DB_URL</w:t>
             </w:r>
@@ -2518,12 +2501,12 @@
         </w:tc>
         <w:tc>
           <w:tcPr>
-            <w:tcW w:type="dxa" w:w="3888"/>
+            <w:tcW w:type="dxa" w:w="2880"/>
             <w:tcMar>
-              <w:top w:w="100" w:type="dxa"/>
-              <w:bottom w:w="100" w:type="dxa"/>
-              <w:left w:w="120" w:type="dxa"/>
-              <w:right w:w="120" w:type="dxa"/>
+              <w:top w:w="90" w:type="dxa"/>
+              <w:bottom w:w="90" w:type="dxa"/>
+              <w:left w:w="100" w:type="dxa"/>
+              <w:right w:w="100" w:type="dxa"/>
             </w:tcMar>
             <w:shd w:fill="F7FAFC"/>
           </w:tcPr>
@@ -2535,7 +2518,7 @@
               <w:rPr>
                 <w:rFonts w:ascii="Calibri" w:hAnsi="Calibri"/>
                 <w:color w:val="2D3748"/>
-                <w:sz w:val="17"/>
+                <w:sz w:val="16"/>
               </w:rPr>
               <w:t>jdbc:postgresql://db.supabase.co:5432/postgres</w:t>
             </w:r>
@@ -2543,12 +2526,12 @@
         </w:tc>
         <w:tc>
           <w:tcPr>
-            <w:tcW w:type="dxa" w:w="3888"/>
+            <w:tcW w:type="dxa" w:w="2880"/>
             <w:tcMar>
-              <w:top w:w="100" w:type="dxa"/>
-              <w:bottom w:w="100" w:type="dxa"/>
-              <w:left w:w="120" w:type="dxa"/>
-              <w:right w:w="120" w:type="dxa"/>
+              <w:top w:w="90" w:type="dxa"/>
+              <w:bottom w:w="90" w:type="dxa"/>
+              <w:left w:w="100" w:type="dxa"/>
+              <w:right w:w="100" w:type="dxa"/>
             </w:tcMar>
             <w:shd w:fill="F7FAFC"/>
           </w:tcPr>
@@ -2560,9 +2543,34 @@
               <w:rPr>
                 <w:rFonts w:ascii="Calibri" w:hAnsi="Calibri"/>
                 <w:color w:val="2D3748"/>
-                <w:sz w:val="17"/>
+                <w:sz w:val="16"/>
               </w:rPr>
-              <w:t>jdbc:postgresql://crm-prod.postgres.database.azure.com:5432/crmdb</w:t>
+              <w:t>jdbc:postgresql://db:5432/crmdb</w:t>
+            </w:r>
+          </w:p>
+        </w:tc>
+        <w:tc>
+          <w:tcPr>
+            <w:tcW w:type="dxa" w:w="3024"/>
+            <w:tcMar>
+              <w:top w:w="90" w:type="dxa"/>
+              <w:bottom w:w="90" w:type="dxa"/>
+              <w:left w:w="100" w:type="dxa"/>
+              <w:right w:w="100" w:type="dxa"/>
+            </w:tcMar>
+            <w:shd w:fill="F7FAFC"/>
+          </w:tcPr>
+          <w:p>
+            <w:pPr>
+              <w:spacing w:before="40" w:after="40"/>
+            </w:pPr>
+            <w:r>
+              <w:rPr>
+                <w:rFonts w:ascii="Calibri" w:hAnsi="Calibri"/>
+                <w:color w:val="2D3748"/>
+                <w:sz w:val="16"/>
+              </w:rPr>
+              <w:t>jdbc:postgresql://crm.postgres.database.azure.com:5432/crmdb</w:t>
             </w:r>
           </w:p>
         </w:tc>
@@ -2570,12 +2578,12 @@
       <w:tr>
         <w:tc>
           <w:tcPr>
-            <w:tcW w:type="dxa" w:w="2880"/>
+            <w:tcW w:type="dxa" w:w="2160"/>
             <w:tcMar>
-              <w:top w:w="100" w:type="dxa"/>
-              <w:bottom w:w="100" w:type="dxa"/>
-              <w:left w:w="120" w:type="dxa"/>
-              <w:right w:w="120" w:type="dxa"/>
+              <w:top w:w="90" w:type="dxa"/>
+              <w:bottom w:w="90" w:type="dxa"/>
+              <w:left w:w="100" w:type="dxa"/>
+              <w:right w:w="100" w:type="dxa"/>
             </w:tcMar>
             <w:shd w:fill="FFFFFF"/>
           </w:tcPr>
@@ -2587,7 +2595,7 @@
               <w:rPr>
                 <w:rFonts w:ascii="Calibri" w:hAnsi="Calibri"/>
                 <w:color w:val="2D3748"/>
-                <w:sz w:val="17"/>
+                <w:sz w:val="16"/>
               </w:rPr>
               <w:t>DB_USER</w:t>
             </w:r>
@@ -2595,12 +2603,12 @@
         </w:tc>
         <w:tc>
           <w:tcPr>
-            <w:tcW w:type="dxa" w:w="3888"/>
+            <w:tcW w:type="dxa" w:w="2880"/>
             <w:tcMar>
-              <w:top w:w="100" w:type="dxa"/>
-              <w:bottom w:w="100" w:type="dxa"/>
-              <w:left w:w="120" w:type="dxa"/>
-              <w:right w:w="120" w:type="dxa"/>
+              <w:top w:w="90" w:type="dxa"/>
+              <w:bottom w:w="90" w:type="dxa"/>
+              <w:left w:w="100" w:type="dxa"/>
+              <w:right w:w="100" w:type="dxa"/>
             </w:tcMar>
             <w:shd w:fill="FFFFFF"/>
           </w:tcPr>
@@ -2612,20 +2620,20 @@
               <w:rPr>
                 <w:rFonts w:ascii="Calibri" w:hAnsi="Calibri"/>
                 <w:color w:val="2D3748"/>
-                <w:sz w:val="17"/>
+                <w:sz w:val="16"/>
               </w:rPr>
-              <w:t>postgres.free_pool</w:t>
+              <w:t>postgres.free</w:t>
             </w:r>
           </w:p>
         </w:tc>
         <w:tc>
           <w:tcPr>
-            <w:tcW w:type="dxa" w:w="3888"/>
+            <w:tcW w:type="dxa" w:w="2880"/>
             <w:tcMar>
-              <w:top w:w="100" w:type="dxa"/>
-              <w:bottom w:w="100" w:type="dxa"/>
-              <w:left w:w="120" w:type="dxa"/>
-              <w:right w:w="120" w:type="dxa"/>
+              <w:top w:w="90" w:type="dxa"/>
+              <w:bottom w:w="90" w:type="dxa"/>
+              <w:left w:w="100" w:type="dxa"/>
+              <w:right w:w="100" w:type="dxa"/>
             </w:tcMar>
             <w:shd w:fill="FFFFFF"/>
           </w:tcPr>
@@ -2637,7 +2645,32 @@
               <w:rPr>
                 <w:rFonts w:ascii="Calibri" w:hAnsi="Calibri"/>
                 <w:color w:val="2D3748"/>
-                <w:sz w:val="17"/>
+                <w:sz w:val="16"/>
+              </w:rPr>
+              <w:t>crm_vps_user</w:t>
+            </w:r>
+          </w:p>
+        </w:tc>
+        <w:tc>
+          <w:tcPr>
+            <w:tcW w:type="dxa" w:w="3024"/>
+            <w:tcMar>
+              <w:top w:w="90" w:type="dxa"/>
+              <w:bottom w:w="90" w:type="dxa"/>
+              <w:left w:w="100" w:type="dxa"/>
+              <w:right w:w="100" w:type="dxa"/>
+            </w:tcMar>
+            <w:shd w:fill="FFFFFF"/>
+          </w:tcPr>
+          <w:p>
+            <w:pPr>
+              <w:spacing w:before="40" w:after="40"/>
+            </w:pPr>
+            <w:r>
+              <w:rPr>
+                <w:rFonts w:ascii="Calibri" w:hAnsi="Calibri"/>
+                <w:color w:val="2D3748"/>
+                <w:sz w:val="16"/>
               </w:rPr>
               <w:t>azure_crm_admin</w:t>
             </w:r>
@@ -2647,12 +2680,12 @@
       <w:tr>
         <w:tc>
           <w:tcPr>
-            <w:tcW w:type="dxa" w:w="2880"/>
+            <w:tcW w:type="dxa" w:w="2160"/>
             <w:tcMar>
-              <w:top w:w="100" w:type="dxa"/>
-              <w:bottom w:w="100" w:type="dxa"/>
-              <w:left w:w="120" w:type="dxa"/>
-              <w:right w:w="120" w:type="dxa"/>
+              <w:top w:w="90" w:type="dxa"/>
+              <w:bottom w:w="90" w:type="dxa"/>
+              <w:left w:w="100" w:type="dxa"/>
+              <w:right w:w="100" w:type="dxa"/>
             </w:tcMar>
             <w:shd w:fill="F7FAFC"/>
           </w:tcPr>
@@ -2664,7 +2697,7 @@
               <w:rPr>
                 <w:rFonts w:ascii="Calibri" w:hAnsi="Calibri"/>
                 <w:color w:val="2D3748"/>
-                <w:sz w:val="17"/>
+                <w:sz w:val="16"/>
               </w:rPr>
               <w:t>DB_PASSWORD</w:t>
             </w:r>
@@ -2672,12 +2705,12 @@
         </w:tc>
         <w:tc>
           <w:tcPr>
-            <w:tcW w:type="dxa" w:w="3888"/>
+            <w:tcW w:type="dxa" w:w="2880"/>
             <w:tcMar>
-              <w:top w:w="100" w:type="dxa"/>
-              <w:bottom w:w="100" w:type="dxa"/>
-              <w:left w:w="120" w:type="dxa"/>
-              <w:right w:w="120" w:type="dxa"/>
+              <w:top w:w="90" w:type="dxa"/>
+              <w:bottom w:w="90" w:type="dxa"/>
+              <w:left w:w="100" w:type="dxa"/>
+              <w:right w:w="100" w:type="dxa"/>
             </w:tcMar>
             <w:shd w:fill="F7FAFC"/>
           </w:tcPr>
@@ -2689,7 +2722,7 @@
               <w:rPr>
                 <w:rFonts w:ascii="Calibri" w:hAnsi="Calibri"/>
                 <w:color w:val="2D3748"/>
-                <w:sz w:val="17"/>
+                <w:sz w:val="16"/>
               </w:rPr>
               <w:t>supabase_env_pass</w:t>
             </w:r>
@@ -2697,12 +2730,12 @@
         </w:tc>
         <w:tc>
           <w:tcPr>
-            <w:tcW w:type="dxa" w:w="3888"/>
+            <w:tcW w:type="dxa" w:w="2880"/>
             <w:tcMar>
-              <w:top w:w="100" w:type="dxa"/>
-              <w:bottom w:w="100" w:type="dxa"/>
-              <w:left w:w="120" w:type="dxa"/>
-              <w:right w:w="120" w:type="dxa"/>
+              <w:top w:w="90" w:type="dxa"/>
+              <w:bottom w:w="90" w:type="dxa"/>
+              <w:left w:w="100" w:type="dxa"/>
+              <w:right w:w="100" w:type="dxa"/>
             </w:tcMar>
             <w:shd w:fill="F7FAFC"/>
           </w:tcPr>
@@ -2714,9 +2747,34 @@
               <w:rPr>
                 <w:rFonts w:ascii="Calibri" w:hAnsi="Calibri"/>
                 <w:color w:val="2D3748"/>
-                <w:sz w:val="17"/>
+                <w:sz w:val="16"/>
               </w:rPr>
-              <w:t>${AZURE_KEY_VAULT_DB_SECRET}</w:t>
+              <w:t>${VPS_STRONG_PASSWORD}</w:t>
+            </w:r>
+          </w:p>
+        </w:tc>
+        <w:tc>
+          <w:tcPr>
+            <w:tcW w:type="dxa" w:w="3024"/>
+            <w:tcMar>
+              <w:top w:w="90" w:type="dxa"/>
+              <w:bottom w:w="90" w:type="dxa"/>
+              <w:left w:w="100" w:type="dxa"/>
+              <w:right w:w="100" w:type="dxa"/>
+            </w:tcMar>
+            <w:shd w:fill="F7FAFC"/>
+          </w:tcPr>
+          <w:p>
+            <w:pPr>
+              <w:spacing w:before="40" w:after="40"/>
+            </w:pPr>
+            <w:r>
+              <w:rPr>
+                <w:rFonts w:ascii="Calibri" w:hAnsi="Calibri"/>
+                <w:color w:val="2D3748"/>
+                <w:sz w:val="16"/>
+              </w:rPr>
+              <w:t>${AZURE_KEY_VAULT_SECRET}</w:t>
             </w:r>
           </w:p>
         </w:tc>
@@ -2724,12 +2782,12 @@
       <w:tr>
         <w:tc>
           <w:tcPr>
-            <w:tcW w:type="dxa" w:w="2880"/>
+            <w:tcW w:type="dxa" w:w="2160"/>
             <w:tcMar>
-              <w:top w:w="100" w:type="dxa"/>
-              <w:bottom w:w="100" w:type="dxa"/>
-              <w:left w:w="120" w:type="dxa"/>
-              <w:right w:w="120" w:type="dxa"/>
+              <w:top w:w="90" w:type="dxa"/>
+              <w:bottom w:w="90" w:type="dxa"/>
+              <w:left w:w="100" w:type="dxa"/>
+              <w:right w:w="100" w:type="dxa"/>
             </w:tcMar>
             <w:shd w:fill="FFFFFF"/>
           </w:tcPr>
@@ -2741,7 +2799,7 @@
               <w:rPr>
                 <w:rFonts w:ascii="Calibri" w:hAnsi="Calibri"/>
                 <w:color w:val="2D3748"/>
-                <w:sz w:val="17"/>
+                <w:sz w:val="16"/>
               </w:rPr>
               <w:t>JWT_SECRET</w:t>
             </w:r>
@@ -2749,12 +2807,12 @@
         </w:tc>
         <w:tc>
           <w:tcPr>
-            <w:tcW w:type="dxa" w:w="3888"/>
+            <w:tcW w:type="dxa" w:w="2880"/>
             <w:tcMar>
-              <w:top w:w="100" w:type="dxa"/>
-              <w:bottom w:w="100" w:type="dxa"/>
-              <w:left w:w="120" w:type="dxa"/>
-              <w:right w:w="120" w:type="dxa"/>
+              <w:top w:w="90" w:type="dxa"/>
+              <w:bottom w:w="90" w:type="dxa"/>
+              <w:left w:w="100" w:type="dxa"/>
+              <w:right w:w="100" w:type="dxa"/>
             </w:tcMar>
             <w:shd w:fill="FFFFFF"/>
           </w:tcPr>
@@ -2766,20 +2824,20 @@
               <w:rPr>
                 <w:rFonts w:ascii="Calibri" w:hAnsi="Calibri"/>
                 <w:color w:val="2D3748"/>
-                <w:sz w:val="17"/>
+                <w:sz w:val="16"/>
               </w:rPr>
-              <w:t>local_render_secret_key_256bit</w:t>
+              <w:t>poc_secret_key_256bit</w:t>
             </w:r>
           </w:p>
         </w:tc>
         <w:tc>
           <w:tcPr>
-            <w:tcW w:type="dxa" w:w="3888"/>
+            <w:tcW w:type="dxa" w:w="2880"/>
             <w:tcMar>
-              <w:top w:w="100" w:type="dxa"/>
-              <w:bottom w:w="100" w:type="dxa"/>
-              <w:left w:w="120" w:type="dxa"/>
-              <w:right w:w="120" w:type="dxa"/>
+              <w:top w:w="90" w:type="dxa"/>
+              <w:bottom w:w="90" w:type="dxa"/>
+              <w:left w:w="100" w:type="dxa"/>
+              <w:right w:w="100" w:type="dxa"/>
             </w:tcMar>
             <w:shd w:fill="FFFFFF"/>
           </w:tcPr>
@@ -2791,7 +2849,32 @@
               <w:rPr>
                 <w:rFonts w:ascii="Calibri" w:hAnsi="Calibri"/>
                 <w:color w:val="2D3748"/>
-                <w:sz w:val="17"/>
+                <w:sz w:val="16"/>
+              </w:rPr>
+              <w:t>${VPS_JWT_SECRET}</w:t>
+            </w:r>
+          </w:p>
+        </w:tc>
+        <w:tc>
+          <w:tcPr>
+            <w:tcW w:type="dxa" w:w="3024"/>
+            <w:tcMar>
+              <w:top w:w="90" w:type="dxa"/>
+              <w:bottom w:w="90" w:type="dxa"/>
+              <w:left w:w="100" w:type="dxa"/>
+              <w:right w:w="100" w:type="dxa"/>
+            </w:tcMar>
+            <w:shd w:fill="FFFFFF"/>
+          </w:tcPr>
+          <w:p>
+            <w:pPr>
+              <w:spacing w:before="40" w:after="40"/>
+            </w:pPr>
+            <w:r>
+              <w:rPr>
+                <w:rFonts w:ascii="Calibri" w:hAnsi="Calibri"/>
+                <w:color w:val="2D3748"/>
+                <w:sz w:val="16"/>
               </w:rPr>
               <w:t>${AZURE_KEY_VAULT_JWT_SECRET}</w:t>
             </w:r>
@@ -2801,12 +2884,12 @@
       <w:tr>
         <w:tc>
           <w:tcPr>
-            <w:tcW w:type="dxa" w:w="2880"/>
+            <w:tcW w:type="dxa" w:w="2160"/>
             <w:tcMar>
-              <w:top w:w="100" w:type="dxa"/>
-              <w:bottom w:w="100" w:type="dxa"/>
-              <w:left w:w="120" w:type="dxa"/>
-              <w:right w:w="120" w:type="dxa"/>
+              <w:top w:w="90" w:type="dxa"/>
+              <w:bottom w:w="90" w:type="dxa"/>
+              <w:left w:w="100" w:type="dxa"/>
+              <w:right w:w="100" w:type="dxa"/>
             </w:tcMar>
             <w:shd w:fill="F7FAFC"/>
           </w:tcPr>
@@ -2818,7 +2901,7 @@
               <w:rPr>
                 <w:rFonts w:ascii="Calibri" w:hAnsi="Calibri"/>
                 <w:color w:val="2D3748"/>
-                <w:sz w:val="17"/>
+                <w:sz w:val="16"/>
               </w:rPr>
               <w:t>FRONTEND_URL</w:t>
             </w:r>
@@ -2826,12 +2909,12 @@
         </w:tc>
         <w:tc>
           <w:tcPr>
-            <w:tcW w:type="dxa" w:w="3888"/>
+            <w:tcW w:type="dxa" w:w="2880"/>
             <w:tcMar>
-              <w:top w:w="100" w:type="dxa"/>
-              <w:bottom w:w="100" w:type="dxa"/>
-              <w:left w:w="120" w:type="dxa"/>
-              <w:right w:w="120" w:type="dxa"/>
+              <w:top w:w="90" w:type="dxa"/>
+              <w:bottom w:w="90" w:type="dxa"/>
+              <w:left w:w="100" w:type="dxa"/>
+              <w:right w:w="100" w:type="dxa"/>
             </w:tcMar>
             <w:shd w:fill="F7FAFC"/>
           </w:tcPr>
@@ -2843,20 +2926,20 @@
               <w:rPr>
                 <w:rFonts w:ascii="Calibri" w:hAnsi="Calibri"/>
                 <w:color w:val="2D3748"/>
-                <w:sz w:val="17"/>
+                <w:sz w:val="16"/>
               </w:rPr>
-              <w:t>https://akilli-saha-crm.vercel.app</w:t>
+              <w:t>https://crm.vercel.app</w:t>
             </w:r>
           </w:p>
         </w:tc>
         <w:tc>
           <w:tcPr>
-            <w:tcW w:type="dxa" w:w="3888"/>
+            <w:tcW w:type="dxa" w:w="2880"/>
             <w:tcMar>
-              <w:top w:w="100" w:type="dxa"/>
-              <w:bottom w:w="100" w:type="dxa"/>
-              <w:left w:w="120" w:type="dxa"/>
-              <w:right w:w="120" w:type="dxa"/>
+              <w:top w:w="90" w:type="dxa"/>
+              <w:bottom w:w="90" w:type="dxa"/>
+              <w:left w:w="100" w:type="dxa"/>
+              <w:right w:w="100" w:type="dxa"/>
             </w:tcMar>
             <w:shd w:fill="F7FAFC"/>
           </w:tcPr>
@@ -2868,9 +2951,34 @@
               <w:rPr>
                 <w:rFonts w:ascii="Calibri" w:hAnsi="Calibri"/>
                 <w:color w:val="2D3748"/>
-                <w:sz w:val="17"/>
+                <w:sz w:val="16"/>
               </w:rPr>
-              <w:t>https://saha.sirketiniz.com (Custom Domain)</w:t>
+              <w:t>https://crm.sahaasistani.com</w:t>
+            </w:r>
+          </w:p>
+        </w:tc>
+        <w:tc>
+          <w:tcPr>
+            <w:tcW w:type="dxa" w:w="3024"/>
+            <w:tcMar>
+              <w:top w:w="90" w:type="dxa"/>
+              <w:bottom w:w="90" w:type="dxa"/>
+              <w:left w:w="100" w:type="dxa"/>
+              <w:right w:w="100" w:type="dxa"/>
+            </w:tcMar>
+            <w:shd w:fill="F7FAFC"/>
+          </w:tcPr>
+          <w:p>
+            <w:pPr>
+              <w:spacing w:before="40" w:after="40"/>
+            </w:pPr>
+            <w:r>
+              <w:rPr>
+                <w:rFonts w:ascii="Calibri" w:hAnsi="Calibri"/>
+                <w:color w:val="2D3748"/>
+                <w:sz w:val="16"/>
+              </w:rPr>
+              <w:t>https://saha.musterifirma.com</w:t>
             </w:r>
           </w:p>
         </w:tc>
@@ -2888,7 +2996,7 @@
           <w:color w:val="1A365D"/>
           <w:sz w:val="28"/>
         </w:rPr>
-        <w:t>5. Sonuç ve Uygulama Hazırlığı</w:t>
+        <w:t>5. Sonuç</w:t>
       </w:r>
     </w:p>
     <w:p>
@@ -2901,7 +3009,7 @@
           <w:color w:val="2D3748"/>
           <w:sz w:val="21"/>
         </w:rPr>
-        <w:t>Bu mimari rapor; saha satış temsilcisinin Excel çilesini ortadan kaldıran, veri kaybını engelleyen ve şirkete tek kuruş altyapı faturası çıkarmadan canlıya alınan bir ürün vizyonunu ortaya koymaktadır. Kod yazımına başlandığında tüm ekip üyeleri ve modüller bu mimari dokümana sadık kalarak ilerleyecektir.</w:t>
+        <w:t>Bu mimari ve dağıtım planı; saha ekibinin veri giriş çilesini bitiren, geliştirme aşamasında sıfır maliyetle başlayan, demo aşamasında cüzi bir VPS ile maksimum hız ve kararlılık yakalayan, satış anında ise müşterinin ihtiyacına göre Ekonomik VPS veya Azure Kurumsal modellerini tek tıkla sunabilen hibrit ve kusursuz bir yol haritası sunmaktadır.</w:t>
       </w:r>
     </w:p>
     <w:sectPr>

</xml_diff>